<commit_message>
Cleaned up the questions
</commit_message>
<xml_diff>
--- a/Work/Assignment 1 - Draft 3.docx
+++ b/Work/Assignment 1 - Draft 3.docx
@@ -519,6 +519,9 @@
       </w:r>
     </w:p>
     <w:p>
+      <w:pPr>
+        <w:pStyle w:val="Caption"/>
+      </w:pPr>
       <w:r>
         <w:t>Source – Author</w:t>
       </w:r>
@@ -547,9 +550,9 @@
           <w:noProof/>
         </w:rPr>
         <w:drawing>
-          <wp:inline distT="0" distB="0" distL="0" distR="0" wp14:anchorId="7928542D" wp14:editId="12654802">
-            <wp:extent cx="5731510" cy="1315085"/>
-            <wp:effectExtent l="0" t="0" r="2540" b="0"/>
+          <wp:inline distT="0" distB="0" distL="0" distR="0" wp14:anchorId="7928542D" wp14:editId="40862800">
+            <wp:extent cx="4604657" cy="1056531"/>
+            <wp:effectExtent l="0" t="0" r="5715" b="0"/>
             <wp:docPr id="6" name="Picture 6" descr="A screenshot of a computer code&#10;&#10;Description automatically generated"/>
             <wp:cNvGraphicFramePr>
               <a:graphicFrameLocks xmlns:a="http://schemas.openxmlformats.org/drawingml/2006/main" noChangeAspect="1"/>
@@ -570,7 +573,7 @@
                   <pic:spPr>
                     <a:xfrm>
                       <a:off x="0" y="0"/>
-                      <a:ext cx="5731510" cy="1315085"/>
+                      <a:ext cx="4654667" cy="1068006"/>
                     </a:xfrm>
                     <a:prstGeom prst="rect">
                       <a:avLst/>
@@ -603,8 +606,26 @@
       </w:r>
     </w:p>
     <w:p>
-      <w:r>
-        <w:t>Source – Author</w:t>
+      <w:pPr>
+        <w:pStyle w:val="Caption"/>
+      </w:pPr>
+      <w:r>
+        <w:t xml:space="preserve">Source </w:t>
+      </w:r>
+      <w:r>
+        <w:softHyphen/>
+      </w:r>
+      <w:r>
+        <w:softHyphen/>
+      </w:r>
+      <w:r>
+        <w:softHyphen/>
+      </w:r>
+      <w:r>
+        <w:softHyphen/>
+      </w:r>
+      <w:r>
+        <w:t>– Author</w:t>
       </w:r>
     </w:p>
     <w:p>
@@ -673,16 +694,19 @@
       </w:r>
     </w:p>
     <w:p>
+      <w:pPr>
+        <w:pStyle w:val="Caption"/>
+      </w:pPr>
+      <w:r>
+        <w:t>Source – Author</w:t>
+      </w:r>
+    </w:p>
+    <w:p>
+      <w:pPr>
+        <w:pStyle w:val="Heading1"/>
+      </w:pPr>
       <w:r>
         <w:lastRenderedPageBreak/>
-        <w:t>Source – Author</w:t>
-      </w:r>
-    </w:p>
-    <w:p>
-      <w:pPr>
-        <w:pStyle w:val="Heading1"/>
-      </w:pPr>
-      <w:r>
         <w:t>Question 3: Display Final 3 Rows</w:t>
       </w:r>
     </w:p>
@@ -694,15 +718,16 @@
     <w:p>
       <w:pPr>
         <w:keepNext/>
+        <w:jc w:val="center"/>
       </w:pPr>
       <w:r>
         <w:rPr>
           <w:noProof/>
         </w:rPr>
         <w:drawing>
-          <wp:inline distT="0" distB="0" distL="0" distR="0" wp14:anchorId="5D84CB35" wp14:editId="52F38260">
-            <wp:extent cx="3258910" cy="1214325"/>
-            <wp:effectExtent l="0" t="0" r="0" b="5080"/>
+          <wp:inline distT="0" distB="0" distL="0" distR="0" wp14:anchorId="5D84CB35" wp14:editId="14A62D56">
+            <wp:extent cx="3037114" cy="1131680"/>
+            <wp:effectExtent l="0" t="0" r="0" b="0"/>
             <wp:docPr id="8" name="Picture 8" descr="A screen shot of a computer code&#10;&#10;Description automatically generated"/>
             <wp:cNvGraphicFramePr>
               <a:graphicFrameLocks xmlns:a="http://schemas.openxmlformats.org/drawingml/2006/main" noChangeAspect="1"/>
@@ -723,7 +748,7 @@
                   <pic:spPr>
                     <a:xfrm>
                       <a:off x="0" y="0"/>
-                      <a:ext cx="3280842" cy="1222497"/>
+                      <a:ext cx="3073544" cy="1145254"/>
                     </a:xfrm>
                     <a:prstGeom prst="rect">
                       <a:avLst/>
@@ -756,6 +781,9 @@
       </w:r>
     </w:p>
     <w:p>
+      <w:pPr>
+        <w:pStyle w:val="Caption"/>
+      </w:pPr>
       <w:r>
         <w:t>Source - Author</w:t>
       </w:r>
@@ -763,6 +791,7 @@
     <w:p>
       <w:pPr>
         <w:keepNext/>
+        <w:jc w:val="center"/>
       </w:pPr>
       <w:r>
         <w:rPr>
@@ -825,6 +854,9 @@
       </w:r>
     </w:p>
     <w:p>
+      <w:pPr>
+        <w:pStyle w:val="Caption"/>
+      </w:pPr>
       <w:r>
         <w:t xml:space="preserve">Source </w:t>
       </w:r>
@@ -924,8 +956,11 @@
       </w:r>
     </w:p>
     <w:p>
-      <w:r>
-        <w:lastRenderedPageBreak/>
+      <w:pPr>
+        <w:keepNext/>
+        <w:jc w:val="center"/>
+      </w:pPr>
+      <w:r>
         <w:drawing>
           <wp:inline distT="0" distB="0" distL="0" distR="0" wp14:anchorId="56778C70" wp14:editId="20465825">
             <wp:extent cx="3940629" cy="714692"/>
@@ -965,9 +1000,37 @@
     </w:p>
     <w:p>
       <w:pPr>
+        <w:pStyle w:val="Caption"/>
+      </w:pPr>
+      <w:r>
+        <w:t xml:space="preserve">Figure </w:t>
+      </w:r>
+      <w:fldSimple w:instr=" SEQ Figure \* ARABIC ">
+        <w:r>
+          <w:rPr>
+            <w:noProof/>
+          </w:rPr>
+          <w:t>10</w:t>
+        </w:r>
+      </w:fldSimple>
+      <w:r>
+        <w:t xml:space="preserve"> - Code to check correct age values</w:t>
+      </w:r>
+    </w:p>
+    <w:p>
+      <w:pPr>
+        <w:pStyle w:val="Caption"/>
+      </w:pPr>
+      <w:r>
+        <w:t>Source - Author</w:t>
+      </w:r>
+    </w:p>
+    <w:p>
+      <w:pPr>
         <w:pStyle w:val="Heading3"/>
       </w:pPr>
       <w:r>
+        <w:lastRenderedPageBreak/>
         <w:t>Gender:</w:t>
       </w:r>
     </w:p>
@@ -986,6 +1049,10 @@
       </w:r>
     </w:p>
     <w:p>
+      <w:pPr>
+        <w:keepNext/>
+        <w:jc w:val="center"/>
+      </w:pPr>
       <w:r>
         <w:drawing>
           <wp:inline distT="0" distB="0" distL="0" distR="0" wp14:anchorId="4DFC2865" wp14:editId="6A152B54">
@@ -1026,6 +1093,33 @@
     </w:p>
     <w:p>
       <w:pPr>
+        <w:pStyle w:val="Caption"/>
+      </w:pPr>
+      <w:r>
+        <w:t xml:space="preserve">Figure </w:t>
+      </w:r>
+      <w:fldSimple w:instr=" SEQ Figure \* ARABIC ">
+        <w:r>
+          <w:rPr>
+            <w:noProof/>
+          </w:rPr>
+          <w:t>11</w:t>
+        </w:r>
+      </w:fldSimple>
+      <w:r>
+        <w:t xml:space="preserve"> - Code to delete blank gender values</w:t>
+      </w:r>
+    </w:p>
+    <w:p>
+      <w:pPr>
+        <w:pStyle w:val="Caption"/>
+      </w:pPr>
+      <w:r>
+        <w:t>Source - Author</w:t>
+      </w:r>
+    </w:p>
+    <w:p>
+      <w:pPr>
         <w:pStyle w:val="Heading3"/>
       </w:pPr>
       <w:r>
@@ -1038,6 +1132,10 @@
       </w:r>
     </w:p>
     <w:p>
+      <w:pPr>
+        <w:keepNext/>
+        <w:jc w:val="center"/>
+      </w:pPr>
       <w:r>
         <w:drawing>
           <wp:inline distT="0" distB="0" distL="0" distR="0" wp14:anchorId="156D9234" wp14:editId="39417247">
@@ -1078,6 +1176,33 @@
     </w:p>
     <w:p>
       <w:pPr>
+        <w:pStyle w:val="Caption"/>
+      </w:pPr>
+      <w:r>
+        <w:t xml:space="preserve">Figure </w:t>
+      </w:r>
+      <w:fldSimple w:instr=" SEQ Figure \* ARABIC ">
+        <w:r>
+          <w:rPr>
+            <w:noProof/>
+          </w:rPr>
+          <w:t>12</w:t>
+        </w:r>
+      </w:fldSimple>
+      <w:r>
+        <w:t xml:space="preserve"> - Placing all cholesterol between the acceptable values</w:t>
+      </w:r>
+    </w:p>
+    <w:p>
+      <w:pPr>
+        <w:pStyle w:val="Caption"/>
+      </w:pPr>
+      <w:r>
+        <w:t>Source - Author</w:t>
+      </w:r>
+    </w:p>
+    <w:p>
+      <w:pPr>
         <w:pStyle w:val="Heading3"/>
       </w:pPr>
       <w:r>
@@ -1096,6 +1221,10 @@
       </w:r>
     </w:p>
     <w:p>
+      <w:pPr>
+        <w:keepNext/>
+        <w:jc w:val="center"/>
+      </w:pPr>
       <w:r>
         <w:drawing>
           <wp:inline distT="0" distB="0" distL="0" distR="0" wp14:anchorId="4A206B8D" wp14:editId="3BD1ADB1">
@@ -1136,6 +1265,33 @@
     </w:p>
     <w:p>
       <w:pPr>
+        <w:pStyle w:val="Caption"/>
+      </w:pPr>
+      <w:r>
+        <w:t xml:space="preserve">Figure </w:t>
+      </w:r>
+      <w:fldSimple w:instr=" SEQ Figure \* ARABIC ">
+        <w:r>
+          <w:rPr>
+            <w:noProof/>
+          </w:rPr>
+          <w:t>13</w:t>
+        </w:r>
+      </w:fldSimple>
+      <w:r>
+        <w:t xml:space="preserve"> - Dropping all values that are not risk_status values</w:t>
+      </w:r>
+    </w:p>
+    <w:p>
+      <w:pPr>
+        <w:pStyle w:val="Caption"/>
+      </w:pPr>
+      <w:r>
+        <w:t>Source - Author</w:t>
+      </w:r>
+    </w:p>
+    <w:p>
+      <w:pPr>
         <w:pStyle w:val="Heading3"/>
       </w:pPr>
       <w:r>
@@ -1216,8 +1372,14 @@
         <w:t>themselves are correct and all negative ones will be given an absolute to be made positive.</w:t>
       </w:r>
     </w:p>
-    <w:p>
-      <w:r>
+    <w:p/>
+    <w:p>
+      <w:pPr>
+        <w:keepNext/>
+        <w:jc w:val="center"/>
+      </w:pPr>
+      <w:r>
+        <w:lastRenderedPageBreak/>
         <w:drawing>
           <wp:inline distT="0" distB="0" distL="0" distR="0" wp14:anchorId="61148FD2" wp14:editId="15947143">
             <wp:extent cx="5731510" cy="539115"/>
@@ -1257,6 +1419,33 @@
     </w:p>
     <w:p>
       <w:pPr>
+        <w:pStyle w:val="Caption"/>
+      </w:pPr>
+      <w:r>
+        <w:t xml:space="preserve">Figure </w:t>
+      </w:r>
+      <w:fldSimple w:instr=" SEQ Figure \* ARABIC ">
+        <w:r>
+          <w:rPr>
+            <w:noProof/>
+          </w:rPr>
+          <w:t>14</w:t>
+        </w:r>
+      </w:fldSimple>
+      <w:r>
+        <w:t xml:space="preserve"> - Absolution of the BMI values</w:t>
+      </w:r>
+    </w:p>
+    <w:p>
+      <w:pPr>
+        <w:pStyle w:val="Caption"/>
+      </w:pPr>
+      <w:r>
+        <w:t>Source - Author</w:t>
+      </w:r>
+    </w:p>
+    <w:p>
+      <w:pPr>
         <w:pStyle w:val="Heading3"/>
       </w:pPr>
       <w:r>
@@ -1275,8 +1464,11 @@
       </w:r>
     </w:p>
     <w:p>
-      <w:r>
-        <w:lastRenderedPageBreak/>
+      <w:pPr>
+        <w:keepNext/>
+        <w:jc w:val="center"/>
+      </w:pPr>
+      <w:r>
         <w:drawing>
           <wp:inline distT="0" distB="0" distL="0" distR="0" wp14:anchorId="472160D1" wp14:editId="299D5C06">
             <wp:extent cx="5731510" cy="440690"/>
@@ -1316,6 +1508,33 @@
     </w:p>
     <w:p>
       <w:pPr>
+        <w:pStyle w:val="Caption"/>
+      </w:pPr>
+      <w:r>
+        <w:t xml:space="preserve">Figure </w:t>
+      </w:r>
+      <w:fldSimple w:instr=" SEQ Figure \* ARABIC ">
+        <w:r>
+          <w:rPr>
+            <w:noProof/>
+          </w:rPr>
+          <w:t>15</w:t>
+        </w:r>
+      </w:fldSimple>
+      <w:r>
+        <w:t xml:space="preserve"> - Absolution of negative exercise values</w:t>
+      </w:r>
+    </w:p>
+    <w:p>
+      <w:pPr>
+        <w:pStyle w:val="Caption"/>
+      </w:pPr>
+      <w:r>
+        <w:t>Source - Author</w:t>
+      </w:r>
+    </w:p>
+    <w:p>
+      <w:pPr>
         <w:pStyle w:val="Heading2"/>
         <w:rPr>
           <w:lang w:val="en-US"/>
@@ -1342,13 +1561,16 @@
         <w:t>other values present in that record.</w:t>
       </w:r>
     </w:p>
-    <w:p/>
-    <w:p>
+    <w:p>
+      <w:pPr>
+        <w:keepNext/>
+        <w:jc w:val="center"/>
+      </w:pPr>
       <w:r>
         <w:drawing>
-          <wp:inline distT="0" distB="0" distL="0" distR="0" wp14:anchorId="63E6FFD6" wp14:editId="20DBCA3F">
-            <wp:extent cx="5731510" cy="4618355"/>
-            <wp:effectExtent l="0" t="0" r="2540" b="0"/>
+          <wp:inline distT="0" distB="0" distL="0" distR="0" wp14:anchorId="63E6FFD6" wp14:editId="21D51B16">
+            <wp:extent cx="5290457" cy="4262962"/>
+            <wp:effectExtent l="0" t="0" r="5715" b="4445"/>
             <wp:docPr id="1808931927" name="Picture 1"/>
             <wp:cNvGraphicFramePr>
               <a:graphicFrameLocks xmlns:a="http://schemas.openxmlformats.org/drawingml/2006/main" noChangeAspect="1"/>
@@ -1369,7 +1591,7 @@
                   <pic:spPr>
                     <a:xfrm>
                       <a:off x="0" y="0"/>
-                      <a:ext cx="5731510" cy="4618355"/>
+                      <a:ext cx="5304402" cy="4274198"/>
                     </a:xfrm>
                     <a:prstGeom prst="rect">
                       <a:avLst/>
@@ -1383,6 +1605,36 @@
       </w:r>
     </w:p>
     <w:p>
+      <w:pPr>
+        <w:pStyle w:val="Caption"/>
+      </w:pPr>
+      <w:r>
+        <w:t xml:space="preserve">Figure </w:t>
+      </w:r>
+      <w:fldSimple w:instr=" SEQ Figure \* ARABIC ">
+        <w:r>
+          <w:rPr>
+            <w:noProof/>
+          </w:rPr>
+          <w:t>16</w:t>
+        </w:r>
+      </w:fldSimple>
+      <w:r>
+        <w:t xml:space="preserve"> - Entire codebase for the data clean</w:t>
+      </w:r>
+    </w:p>
+    <w:p>
+      <w:pPr>
+        <w:pStyle w:val="Caption"/>
+      </w:pPr>
+      <w:r>
+        <w:t>Source - Author</w:t>
+      </w:r>
+    </w:p>
+    <w:p>
+      <w:pPr>
+        <w:keepNext/>
+      </w:pPr>
       <w:r>
         <w:lastRenderedPageBreak/>
         <w:drawing>
@@ -1420,6 +1672,33 @@
             </a:graphic>
           </wp:inline>
         </w:drawing>
+      </w:r>
+    </w:p>
+    <w:p>
+      <w:pPr>
+        <w:pStyle w:val="Caption"/>
+      </w:pPr>
+      <w:r>
+        <w:t xml:space="preserve">Figure </w:t>
+      </w:r>
+      <w:fldSimple w:instr=" SEQ Figure \* ARABIC ">
+        <w:r>
+          <w:rPr>
+            <w:noProof/>
+          </w:rPr>
+          <w:t>17</w:t>
+        </w:r>
+      </w:fldSimple>
+      <w:r>
+        <w:t xml:space="preserve"> - TUI for clean data function</w:t>
+      </w:r>
+    </w:p>
+    <w:p>
+      <w:pPr>
+        <w:pStyle w:val="Caption"/>
+      </w:pPr>
+      <w:r>
+        <w:t>Source - Author</w:t>
       </w:r>
     </w:p>
     <w:p>
@@ -1569,9 +1848,9 @@
           <w:noProof/>
         </w:rPr>
         <w:drawing>
-          <wp:inline distT="0" distB="0" distL="0" distR="0" wp14:anchorId="0D333B07" wp14:editId="43F06299">
-            <wp:extent cx="5741877" cy="2147637"/>
-            <wp:effectExtent l="0" t="0" r="0" b="5080"/>
+          <wp:inline distT="0" distB="0" distL="0" distR="0" wp14:anchorId="0D333B07" wp14:editId="4C71B49C">
+            <wp:extent cx="5551714" cy="2076510"/>
+            <wp:effectExtent l="0" t="0" r="0" b="0"/>
             <wp:docPr id="11" name="Picture 11" descr="A screenshot of a computer program&#10;&#10;Description automatically generated"/>
             <wp:cNvGraphicFramePr>
               <a:graphicFrameLocks xmlns:a="http://schemas.openxmlformats.org/drawingml/2006/main" noChangeAspect="1"/>
@@ -1592,7 +1871,7 @@
                   <pic:spPr>
                     <a:xfrm>
                       <a:off x="0" y="0"/>
-                      <a:ext cx="5787642" cy="2164754"/>
+                      <a:ext cx="5602121" cy="2095364"/>
                     </a:xfrm>
                     <a:prstGeom prst="rect">
                       <a:avLst/>
@@ -1617,7 +1896,7 @@
           <w:rPr>
             <w:noProof/>
           </w:rPr>
-          <w:t>10</w:t>
+          <w:t>18</w:t>
         </w:r>
       </w:fldSimple>
       <w:r>
@@ -1625,6 +1904,9 @@
       </w:r>
     </w:p>
     <w:p>
+      <w:pPr>
+        <w:pStyle w:val="Caption"/>
+      </w:pPr>
       <w:r>
         <w:t>Source – Author</w:t>
       </w:r>
@@ -1687,7 +1969,7 @@
           <w:rPr>
             <w:noProof/>
           </w:rPr>
-          <w:t>11</w:t>
+          <w:t>19</w:t>
         </w:r>
       </w:fldSimple>
       <w:r>
@@ -1695,6 +1977,9 @@
       </w:r>
     </w:p>
     <w:p>
+      <w:pPr>
+        <w:pStyle w:val="Caption"/>
+      </w:pPr>
       <w:r>
         <w:t>Source – Author</w:t>
       </w:r>
@@ -1716,12 +2001,36 @@
         <w:t xml:space="preserve">The frequency distribution in the cholesterol histogram can change widely with the number of bins that the developer wishes to include. The more bins the more bars and accurate the chart becomes. </w:t>
       </w:r>
       <w:r>
-        <w:t xml:space="preserve">Here 20 bins was chosen as a middle ground between efficiency and accuracy. </w:t>
-      </w:r>
-    </w:p>
-    <w:p>
-      <w:r>
-        <w:t xml:space="preserve">As shown in Fig X the histogram appears to be normally distributed with the most number of people </w:t>
+        <w:t xml:space="preserve">Here 20 bins </w:t>
+      </w:r>
+      <w:r>
+        <w:t>were</w:t>
+      </w:r>
+      <w:r>
+        <w:t xml:space="preserve"> chosen as a middle ground between efficiency and accuracy. </w:t>
+      </w:r>
+    </w:p>
+    <w:p>
+      <w:r>
+        <w:t>As shown in Fig</w:t>
+      </w:r>
+      <w:r>
+        <w:t>ure</w:t>
+      </w:r>
+      <w:r>
+        <w:t xml:space="preserve"> </w:t>
+      </w:r>
+      <w:r>
+        <w:t>22</w:t>
+      </w:r>
+      <w:r>
+        <w:t xml:space="preserve"> the histogram appears to be normally distributed with </w:t>
+      </w:r>
+      <w:r>
+        <w:t>the greatest</w:t>
+      </w:r>
+      <w:r>
+        <w:t xml:space="preserve"> number of people </w:t>
       </w:r>
       <w:r>
         <w:t xml:space="preserve">grouping around the 50 mark and failing off </w:t>
@@ -1730,17 +2039,20 @@
         <w:t xml:space="preserve">either side towards 0 frequency. </w:t>
       </w:r>
     </w:p>
-    <w:p/>
-    <w:p>
+    <w:p>
+      <w:pPr>
+        <w:keepNext/>
+        <w:jc w:val="center"/>
+      </w:pPr>
       <w:r>
         <w:rPr>
           <w:noProof/>
         </w:rPr>
         <w:drawing>
-          <wp:inline distT="0" distB="0" distL="0" distR="0" wp14:anchorId="5A7AC7D5" wp14:editId="15CB928C">
-            <wp:extent cx="5731510" cy="2362200"/>
-            <wp:effectExtent l="0" t="0" r="2540" b="0"/>
-            <wp:docPr id="590887908" name="Picture 1"/>
+          <wp:inline distT="0" distB="0" distL="0" distR="0" wp14:anchorId="14938AE1" wp14:editId="59BBCC0B">
+            <wp:extent cx="5219700" cy="2205621"/>
+            <wp:effectExtent l="0" t="0" r="0" b="4445"/>
+            <wp:docPr id="1874796863" name="Picture 1"/>
             <wp:cNvGraphicFramePr>
               <a:graphicFrameLocks xmlns:a="http://schemas.openxmlformats.org/drawingml/2006/main" noChangeAspect="1"/>
             </wp:cNvGraphicFramePr>
@@ -1748,7 +2060,7 @@
               <a:graphicData uri="http://schemas.openxmlformats.org/drawingml/2006/picture">
                 <pic:pic xmlns:pic="http://schemas.openxmlformats.org/drawingml/2006/picture">
                   <pic:nvPicPr>
-                    <pic:cNvPr id="590887908" name=""/>
+                    <pic:cNvPr id="1874796863" name=""/>
                     <pic:cNvPicPr/>
                   </pic:nvPicPr>
                   <pic:blipFill>
@@ -1760,7 +2072,7 @@
                   <pic:spPr>
                     <a:xfrm>
                       <a:off x="0" y="0"/>
-                      <a:ext cx="5731510" cy="2362200"/>
+                      <a:ext cx="5234268" cy="2211777"/>
                     </a:xfrm>
                     <a:prstGeom prst="rect">
                       <a:avLst/>
@@ -1774,6 +2086,36 @@
       </w:r>
     </w:p>
     <w:p>
+      <w:pPr>
+        <w:pStyle w:val="Caption"/>
+      </w:pPr>
+      <w:r>
+        <w:t xml:space="preserve">Figure </w:t>
+      </w:r>
+      <w:fldSimple w:instr=" SEQ Figure \* ARABIC ">
+        <w:r>
+          <w:rPr>
+            <w:noProof/>
+          </w:rPr>
+          <w:t>20</w:t>
+        </w:r>
+      </w:fldSimple>
+      <w:r>
+        <w:t xml:space="preserve"> - Code to great the cholesterol histogram</w:t>
+      </w:r>
+    </w:p>
+    <w:p>
+      <w:pPr>
+        <w:pStyle w:val="Caption"/>
+      </w:pPr>
+      <w:r>
+        <w:t>Source - Author</w:t>
+      </w:r>
+    </w:p>
+    <w:p>
+      <w:pPr>
+        <w:keepNext/>
+      </w:pPr>
       <w:r>
         <w:rPr>
           <w:noProof/>
@@ -1817,15 +2159,43 @@
       </w:r>
     </w:p>
     <w:p>
-      <w:r>
-        <w:rPr>
-          <w:noProof/>
-        </w:rPr>
+      <w:pPr>
+        <w:pStyle w:val="Caption"/>
+      </w:pPr>
+      <w:r>
+        <w:t xml:space="preserve">Figure </w:t>
+      </w:r>
+      <w:fldSimple w:instr=" SEQ Figure \* ARABIC ">
+        <w:r>
+          <w:rPr>
+            <w:noProof/>
+          </w:rPr>
+          <w:t>21</w:t>
+        </w:r>
+      </w:fldSimple>
+      <w:r>
+        <w:t xml:space="preserve"> - TUI for histogram graph</w:t>
+      </w:r>
+    </w:p>
+    <w:p>
+      <w:pPr>
+        <w:pStyle w:val="Caption"/>
+      </w:pPr>
+      <w:r>
+        <w:t>Source - Author</w:t>
+      </w:r>
+    </w:p>
+    <w:p>
+      <w:pPr>
+        <w:keepNext/>
+        <w:jc w:val="center"/>
+      </w:pPr>
+      <w:r>
         <w:drawing>
-          <wp:inline distT="0" distB="0" distL="0" distR="0" wp14:anchorId="45E0881D" wp14:editId="46385589">
-            <wp:extent cx="5731510" cy="4578985"/>
-            <wp:effectExtent l="0" t="0" r="2540" b="0"/>
-            <wp:docPr id="530396224" name="Picture 1"/>
+          <wp:inline distT="0" distB="0" distL="0" distR="0" wp14:anchorId="276F64F2" wp14:editId="238F0988">
+            <wp:extent cx="4058830" cy="3209381"/>
+            <wp:effectExtent l="0" t="0" r="0" b="0"/>
+            <wp:docPr id="1346785342" name="Picture 1"/>
             <wp:cNvGraphicFramePr>
               <a:graphicFrameLocks xmlns:a="http://schemas.openxmlformats.org/drawingml/2006/main" noChangeAspect="1"/>
             </wp:cNvGraphicFramePr>
@@ -1833,7 +2203,7 @@
               <a:graphicData uri="http://schemas.openxmlformats.org/drawingml/2006/picture">
                 <pic:pic xmlns:pic="http://schemas.openxmlformats.org/drawingml/2006/picture">
                   <pic:nvPicPr>
-                    <pic:cNvPr id="530396224" name=""/>
+                    <pic:cNvPr id="1346785342" name=""/>
                     <pic:cNvPicPr/>
                   </pic:nvPicPr>
                   <pic:blipFill>
@@ -1845,7 +2215,7 @@
                   <pic:spPr>
                     <a:xfrm>
                       <a:off x="0" y="0"/>
-                      <a:ext cx="5731510" cy="4578985"/>
+                      <a:ext cx="4063567" cy="3213126"/>
                     </a:xfrm>
                     <a:prstGeom prst="rect">
                       <a:avLst/>
@@ -1859,6 +2229,33 @@
       </w:r>
     </w:p>
     <w:p>
+      <w:pPr>
+        <w:pStyle w:val="Caption"/>
+      </w:pPr>
+      <w:r>
+        <w:t xml:space="preserve">Figure </w:t>
+      </w:r>
+      <w:fldSimple w:instr=" SEQ Figure \* ARABIC ">
+        <w:r>
+          <w:rPr>
+            <w:noProof/>
+          </w:rPr>
+          <w:t>22</w:t>
+        </w:r>
+      </w:fldSimple>
+      <w:r>
+        <w:t xml:space="preserve"> - Example cholesterol histogram</w:t>
+      </w:r>
+    </w:p>
+    <w:p>
+      <w:pPr>
+        <w:pStyle w:val="Caption"/>
+      </w:pPr>
+      <w:r>
+        <w:t>Source - Author</w:t>
+      </w:r>
+    </w:p>
+    <w:p>
       <w:r>
         <w:br w:type="page"/>
       </w:r>
@@ -1895,18 +2292,46 @@
         <w:t>.</w:t>
       </w:r>
       <w:r>
-        <w:t xml:space="preserve"> This just creates a visual direction in which the user can see any errors within the data. </w:t>
-      </w:r>
-    </w:p>
-    <w:p>
+        <w:t xml:space="preserve"> This just creates a visual direction in which the user can see any errors within the data</w:t>
+      </w:r>
+      <w:r>
+        <w:t xml:space="preserve"> (Fig</w:t>
+      </w:r>
+      <w:r>
+        <w:t xml:space="preserve"> 25</w:t>
+      </w:r>
+      <w:r>
+        <w:t>)</w:t>
+      </w:r>
+      <w:r>
+        <w:t xml:space="preserve">. </w:t>
+      </w:r>
+      <w:r>
+        <w:t xml:space="preserve">If all data is correct the </w:t>
+      </w:r>
+      <w:r>
+        <w:t>“No Age Entered” column will have some values within it (Fig</w:t>
+      </w:r>
+      <w:r>
+        <w:t xml:space="preserve"> 26</w:t>
+      </w:r>
+      <w:r>
+        <w:t>).</w:t>
+      </w:r>
+    </w:p>
+    <w:p>
+      <w:pPr>
+        <w:keepNext/>
+        <w:jc w:val="center"/>
+      </w:pPr>
       <w:r>
         <w:rPr>
           <w:noProof/>
         </w:rPr>
         <w:drawing>
-          <wp:inline distT="0" distB="0" distL="0" distR="0" wp14:anchorId="2DC288F3" wp14:editId="23D6761C">
-            <wp:extent cx="5731510" cy="4585970"/>
-            <wp:effectExtent l="0" t="0" r="2540" b="5080"/>
+          <wp:inline distT="0" distB="0" distL="0" distR="0" wp14:anchorId="2DC288F3" wp14:editId="35EE5EF7">
+            <wp:extent cx="3632504" cy="2906486"/>
+            <wp:effectExtent l="0" t="0" r="6350" b="8255"/>
             <wp:docPr id="247230515" name="Picture 1"/>
             <wp:cNvGraphicFramePr>
               <a:graphicFrameLocks xmlns:a="http://schemas.openxmlformats.org/drawingml/2006/main" noChangeAspect="1"/>
@@ -1927,7 +2352,7 @@
                   <pic:spPr>
                     <a:xfrm>
                       <a:off x="0" y="0"/>
-                      <a:ext cx="5731510" cy="4585970"/>
+                      <a:ext cx="3639942" cy="2912437"/>
                     </a:xfrm>
                     <a:prstGeom prst="rect">
                       <a:avLst/>
@@ -1941,10 +2366,115 @@
       </w:r>
     </w:p>
     <w:p>
+      <w:pPr>
+        <w:pStyle w:val="Caption"/>
+      </w:pPr>
+      <w:r>
+        <w:t xml:space="preserve">Figure </w:t>
+      </w:r>
+      <w:fldSimple w:instr=" SEQ Figure \* ARABIC ">
+        <w:r>
+          <w:rPr>
+            <w:noProof/>
+          </w:rPr>
+          <w:t>23</w:t>
+        </w:r>
+      </w:fldSimple>
+      <w:r>
+        <w:t xml:space="preserve"> - Code to create the age groupings chart</w:t>
+      </w:r>
+    </w:p>
+    <w:p>
+      <w:pPr>
+        <w:pStyle w:val="Caption"/>
+      </w:pPr>
+      <w:r>
+        <w:t>Source - Author</w:t>
+      </w:r>
+    </w:p>
+    <w:p>
+      <w:pPr>
+        <w:keepNext/>
+      </w:pPr>
       <w:r>
         <w:rPr>
           <w:noProof/>
         </w:rPr>
+        <w:drawing>
+          <wp:inline distT="0" distB="0" distL="0" distR="0" wp14:anchorId="5FFF187E" wp14:editId="4EB911B4">
+            <wp:extent cx="5159829" cy="1749860"/>
+            <wp:effectExtent l="0" t="0" r="3175" b="3175"/>
+            <wp:docPr id="618956773" name="Picture 1"/>
+            <wp:cNvGraphicFramePr>
+              <a:graphicFrameLocks xmlns:a="http://schemas.openxmlformats.org/drawingml/2006/main" noChangeAspect="1"/>
+            </wp:cNvGraphicFramePr>
+            <a:graphic xmlns:a="http://schemas.openxmlformats.org/drawingml/2006/main">
+              <a:graphicData uri="http://schemas.openxmlformats.org/drawingml/2006/picture">
+                <pic:pic xmlns:pic="http://schemas.openxmlformats.org/drawingml/2006/picture">
+                  <pic:nvPicPr>
+                    <pic:cNvPr id="618956773" name=""/>
+                    <pic:cNvPicPr/>
+                  </pic:nvPicPr>
+                  <pic:blipFill>
+                    <a:blip r:embed="rId30"/>
+                    <a:stretch>
+                      <a:fillRect/>
+                    </a:stretch>
+                  </pic:blipFill>
+                  <pic:spPr>
+                    <a:xfrm>
+                      <a:off x="0" y="0"/>
+                      <a:ext cx="5169612" cy="1753178"/>
+                    </a:xfrm>
+                    <a:prstGeom prst="rect">
+                      <a:avLst/>
+                    </a:prstGeom>
+                  </pic:spPr>
+                </pic:pic>
+              </a:graphicData>
+            </a:graphic>
+          </wp:inline>
+        </w:drawing>
+      </w:r>
+    </w:p>
+    <w:p>
+      <w:pPr>
+        <w:pStyle w:val="Caption"/>
+      </w:pPr>
+      <w:r>
+        <w:t xml:space="preserve">Figure </w:t>
+      </w:r>
+      <w:fldSimple w:instr=" SEQ Figure \* ARABIC ">
+        <w:r>
+          <w:rPr>
+            <w:noProof/>
+          </w:rPr>
+          <w:t>24</w:t>
+        </w:r>
+      </w:fldSimple>
+      <w:r>
+        <w:t xml:space="preserve"> - TUI explaining the chart is open in a new window</w:t>
+      </w:r>
+    </w:p>
+    <w:p>
+      <w:pPr>
+        <w:pStyle w:val="Caption"/>
+      </w:pPr>
+      <w:r>
+        <w:t>Source - Author</w:t>
+      </w:r>
+    </w:p>
+    <w:p/>
+    <w:p>
+      <w:pPr>
+        <w:keepNext/>
+        <w:jc w:val="center"/>
+      </w:pPr>
+      <w:r>
+        <w:rPr>
+          <w:noProof/>
+        </w:rPr>
+        <w:lastRenderedPageBreak/>
         <w:drawing>
           <wp:inline distT="0" distB="0" distL="0" distR="0" wp14:anchorId="1A69FE10" wp14:editId="0C7F2279">
             <wp:extent cx="3314700" cy="2513752"/>
@@ -1961,7 +2491,7 @@
                     <pic:cNvPicPr/>
                   </pic:nvPicPr>
                   <pic:blipFill>
-                    <a:blip r:embed="rId30"/>
+                    <a:blip r:embed="rId31"/>
                     <a:stretch>
                       <a:fillRect/>
                     </a:stretch>
@@ -1983,16 +2513,48 @@
       </w:r>
     </w:p>
     <w:p>
-      <w:r>
-        <w:rPr>
-          <w:noProof/>
-        </w:rPr>
-        <w:lastRenderedPageBreak/>
+      <w:pPr>
+        <w:pStyle w:val="Caption"/>
+      </w:pPr>
+      <w:r>
+        <w:t xml:space="preserve">Figure </w:t>
+      </w:r>
+      <w:fldSimple w:instr=" SEQ Figure \* ARABIC ">
+        <w:r>
+          <w:rPr>
+            <w:noProof/>
+          </w:rPr>
+          <w:t>25</w:t>
+        </w:r>
+      </w:fldSimple>
+      <w:r>
+        <w:t xml:space="preserve"> - Age group bar chart before data clean</w:t>
+      </w:r>
+    </w:p>
+    <w:p>
+      <w:pPr>
+        <w:pStyle w:val="Caption"/>
+        <w:keepNext/>
+      </w:pPr>
+      <w:r>
+        <w:t>Source – Author</w:t>
+      </w:r>
+    </w:p>
+    <w:p>
+      <w:pPr>
+        <w:pStyle w:val="Caption"/>
+        <w:keepNext/>
+        <w:jc w:val="center"/>
+      </w:pPr>
+      <w:r>
+        <w:br/>
+      </w:r>
+      <w:r>
         <w:drawing>
-          <wp:inline distT="0" distB="0" distL="0" distR="0" wp14:anchorId="1F9BC606" wp14:editId="5B9A3AE7">
-            <wp:extent cx="5731510" cy="1943735"/>
-            <wp:effectExtent l="0" t="0" r="2540" b="0"/>
-            <wp:docPr id="618956773" name="Picture 1"/>
+          <wp:inline distT="0" distB="0" distL="0" distR="0" wp14:anchorId="294F9ADC" wp14:editId="55A5B783">
+            <wp:extent cx="3528464" cy="2763429"/>
+            <wp:effectExtent l="0" t="0" r="0" b="0"/>
+            <wp:docPr id="2026305727" name="Picture 1"/>
             <wp:cNvGraphicFramePr>
               <a:graphicFrameLocks xmlns:a="http://schemas.openxmlformats.org/drawingml/2006/main" noChangeAspect="1"/>
             </wp:cNvGraphicFramePr>
@@ -2000,11 +2562,11 @@
               <a:graphicData uri="http://schemas.openxmlformats.org/drawingml/2006/picture">
                 <pic:pic xmlns:pic="http://schemas.openxmlformats.org/drawingml/2006/picture">
                   <pic:nvPicPr>
-                    <pic:cNvPr id="618956773" name=""/>
+                    <pic:cNvPr id="2026305727" name=""/>
                     <pic:cNvPicPr/>
                   </pic:nvPicPr>
                   <pic:blipFill>
-                    <a:blip r:embed="rId31"/>
+                    <a:blip r:embed="rId32"/>
                     <a:stretch>
                       <a:fillRect/>
                     </a:stretch>
@@ -2012,7 +2574,7 @@
                   <pic:spPr>
                     <a:xfrm>
                       <a:off x="0" y="0"/>
-                      <a:ext cx="5731510" cy="1943735"/>
+                      <a:ext cx="3535090" cy="2768618"/>
                     </a:xfrm>
                     <a:prstGeom prst="rect">
                       <a:avLst/>
@@ -2025,12 +2587,574 @@
         </w:drawing>
       </w:r>
     </w:p>
-    <w:p/>
+    <w:p>
+      <w:pPr>
+        <w:pStyle w:val="Caption"/>
+      </w:pPr>
+      <w:r>
+        <w:t xml:space="preserve">Figure </w:t>
+      </w:r>
+      <w:fldSimple w:instr=" SEQ Figure \* ARABIC ">
+        <w:r>
+          <w:rPr>
+            <w:noProof/>
+          </w:rPr>
+          <w:t>26</w:t>
+        </w:r>
+      </w:fldSimple>
+      <w:r>
+        <w:t xml:space="preserve"> - Age group bar chart after data clean</w:t>
+      </w:r>
+    </w:p>
+    <w:p>
+      <w:pPr>
+        <w:pStyle w:val="Caption"/>
+      </w:pPr>
+      <w:r>
+        <w:t>Source - Author</w:t>
+      </w:r>
+    </w:p>
     <w:p>
       <w:pPr>
         <w:pStyle w:val="Heading1"/>
       </w:pPr>
       <w:r>
+        <w:t xml:space="preserve">Question </w:t>
+      </w:r>
+      <w:r>
+        <w:t>8: Distribution of Risk Status by Gender</w:t>
+      </w:r>
+    </w:p>
+    <w:p>
+      <w:r>
+        <w:t xml:space="preserve">The error column is included as the clean data is not done automatically. </w:t>
+      </w:r>
+      <w:r>
+        <w:t>This creates a visual cue that a person can look at the data and see that it is incorrect (Fig</w:t>
+      </w:r>
+      <w:r>
+        <w:t xml:space="preserve"> 28</w:t>
+      </w:r>
+      <w:r>
+        <w:t xml:space="preserve">). </w:t>
+      </w:r>
+      <w:r>
+        <w:t>However,</w:t>
+      </w:r>
+      <w:r>
+        <w:t xml:space="preserve"> a more accurate representation can be found </w:t>
+      </w:r>
+      <w:r>
+        <w:t>once the data has been cleaned (Fig</w:t>
+      </w:r>
+      <w:r>
+        <w:t xml:space="preserve"> 29</w:t>
+      </w:r>
+      <w:r>
+        <w:t>).</w:t>
+      </w:r>
+    </w:p>
+    <w:p>
+      <w:commentRangeStart w:id="0"/>
+      <w:r>
+        <w:t>Analysis from the data will be conducted on the clean dataset</w:t>
+      </w:r>
+      <w:r>
+        <w:t xml:space="preserve"> (Fig 29)</w:t>
+      </w:r>
+      <w:r>
+        <w:t>.</w:t>
+      </w:r>
+      <w:r>
+        <w:t xml:space="preserve"> From this is can be shown that men are more at </w:t>
+      </w:r>
+      <w:r>
+        <w:t xml:space="preserve">cardiovascular risk then women.  With gap of the low risk being ~20 women </w:t>
+      </w:r>
+      <w:r>
+        <w:t xml:space="preserve">more than men. </w:t>
+      </w:r>
+      <w:r>
+        <w:t xml:space="preserve">Overall </w:t>
+      </w:r>
+      <w:r>
+        <w:t>~52% of people are considered to be at high cardiovascular risk.</w:t>
+      </w:r>
+      <w:commentRangeEnd w:id="0"/>
+      <w:r>
+        <w:rPr>
+          <w:rStyle w:val="CommentReference"/>
+          <w:sz w:val="24"/>
+          <w:szCs w:val="24"/>
+        </w:rPr>
+        <w:commentReference w:id="0"/>
+      </w:r>
+    </w:p>
+    <w:p>
+      <w:pPr>
+        <w:keepNext/>
+      </w:pPr>
+      <w:r>
+        <w:lastRenderedPageBreak/>
+        <w:drawing>
+          <wp:inline distT="0" distB="0" distL="0" distR="0" wp14:anchorId="70167538" wp14:editId="590B277C">
+            <wp:extent cx="3189061" cy="4924919"/>
+            <wp:effectExtent l="0" t="0" r="0" b="9525"/>
+            <wp:docPr id="2146795638" name="Picture 1"/>
+            <wp:cNvGraphicFramePr>
+              <a:graphicFrameLocks xmlns:a="http://schemas.openxmlformats.org/drawingml/2006/main" noChangeAspect="1"/>
+            </wp:cNvGraphicFramePr>
+            <a:graphic xmlns:a="http://schemas.openxmlformats.org/drawingml/2006/main">
+              <a:graphicData uri="http://schemas.openxmlformats.org/drawingml/2006/picture">
+                <pic:pic xmlns:pic="http://schemas.openxmlformats.org/drawingml/2006/picture">
+                  <pic:nvPicPr>
+                    <pic:cNvPr id="2146795638" name=""/>
+                    <pic:cNvPicPr/>
+                  </pic:nvPicPr>
+                  <pic:blipFill>
+                    <a:blip r:embed="rId37"/>
+                    <a:stretch>
+                      <a:fillRect/>
+                    </a:stretch>
+                  </pic:blipFill>
+                  <pic:spPr>
+                    <a:xfrm>
+                      <a:off x="0" y="0"/>
+                      <a:ext cx="3204699" cy="4949069"/>
+                    </a:xfrm>
+                    <a:prstGeom prst="rect">
+                      <a:avLst/>
+                    </a:prstGeom>
+                  </pic:spPr>
+                </pic:pic>
+              </a:graphicData>
+            </a:graphic>
+          </wp:inline>
+        </w:drawing>
+      </w:r>
+      <w:r>
+        <w:drawing>
+          <wp:inline distT="0" distB="0" distL="0" distR="0" wp14:anchorId="60108683" wp14:editId="71877F9A">
+            <wp:extent cx="3712029" cy="1882335"/>
+            <wp:effectExtent l="0" t="0" r="3175" b="3810"/>
+            <wp:docPr id="829437375" name="Picture 1"/>
+            <wp:cNvGraphicFramePr>
+              <a:graphicFrameLocks xmlns:a="http://schemas.openxmlformats.org/drawingml/2006/main" noChangeAspect="1"/>
+            </wp:cNvGraphicFramePr>
+            <a:graphic xmlns:a="http://schemas.openxmlformats.org/drawingml/2006/main">
+              <a:graphicData uri="http://schemas.openxmlformats.org/drawingml/2006/picture">
+                <pic:pic xmlns:pic="http://schemas.openxmlformats.org/drawingml/2006/picture">
+                  <pic:nvPicPr>
+                    <pic:cNvPr id="829437375" name=""/>
+                    <pic:cNvPicPr/>
+                  </pic:nvPicPr>
+                  <pic:blipFill>
+                    <a:blip r:embed="rId38"/>
+                    <a:stretch>
+                      <a:fillRect/>
+                    </a:stretch>
+                  </pic:blipFill>
+                  <pic:spPr>
+                    <a:xfrm>
+                      <a:off x="0" y="0"/>
+                      <a:ext cx="3742229" cy="1897649"/>
+                    </a:xfrm>
+                    <a:prstGeom prst="rect">
+                      <a:avLst/>
+                    </a:prstGeom>
+                  </pic:spPr>
+                </pic:pic>
+              </a:graphicData>
+            </a:graphic>
+          </wp:inline>
+        </w:drawing>
+      </w:r>
+    </w:p>
+    <w:p>
+      <w:pPr>
+        <w:pStyle w:val="Caption"/>
+      </w:pPr>
+      <w:r>
+        <w:t xml:space="preserve">Figure </w:t>
+      </w:r>
+      <w:fldSimple w:instr=" SEQ Figure \* ARABIC ">
+        <w:r>
+          <w:rPr>
+            <w:noProof/>
+          </w:rPr>
+          <w:t>27</w:t>
+        </w:r>
+      </w:fldSimple>
+      <w:r>
+        <w:t xml:space="preserve"> - Code to create the comparison chart of risk status</w:t>
+      </w:r>
+    </w:p>
+    <w:p>
+      <w:pPr>
+        <w:pStyle w:val="Caption"/>
+      </w:pPr>
+      <w:r>
+        <w:t xml:space="preserve">Source </w:t>
+      </w:r>
+      <w:r>
+        <w:t>–</w:t>
+      </w:r>
+      <w:r>
+        <w:t xml:space="preserve"> Author</w:t>
+      </w:r>
+    </w:p>
+    <w:p>
+      <w:pPr>
+        <w:keepNext/>
+        <w:jc w:val="center"/>
+      </w:pPr>
+      <w:r>
+        <w:lastRenderedPageBreak/>
+        <w:drawing>
+          <wp:inline distT="0" distB="0" distL="0" distR="0" wp14:anchorId="2D924436" wp14:editId="339D40A3">
+            <wp:extent cx="2950029" cy="2315638"/>
+            <wp:effectExtent l="0" t="0" r="3175" b="8890"/>
+            <wp:docPr id="1358863497" name="Picture 1"/>
+            <wp:cNvGraphicFramePr>
+              <a:graphicFrameLocks xmlns:a="http://schemas.openxmlformats.org/drawingml/2006/main" noChangeAspect="1"/>
+            </wp:cNvGraphicFramePr>
+            <a:graphic xmlns:a="http://schemas.openxmlformats.org/drawingml/2006/main">
+              <a:graphicData uri="http://schemas.openxmlformats.org/drawingml/2006/picture">
+                <pic:pic xmlns:pic="http://schemas.openxmlformats.org/drawingml/2006/picture">
+                  <pic:nvPicPr>
+                    <pic:cNvPr id="1358863497" name=""/>
+                    <pic:cNvPicPr/>
+                  </pic:nvPicPr>
+                  <pic:blipFill>
+                    <a:blip r:embed="rId39"/>
+                    <a:stretch>
+                      <a:fillRect/>
+                    </a:stretch>
+                  </pic:blipFill>
+                  <pic:spPr>
+                    <a:xfrm>
+                      <a:off x="0" y="0"/>
+                      <a:ext cx="2962073" cy="2325092"/>
+                    </a:xfrm>
+                    <a:prstGeom prst="rect">
+                      <a:avLst/>
+                    </a:prstGeom>
+                  </pic:spPr>
+                </pic:pic>
+              </a:graphicData>
+            </a:graphic>
+          </wp:inline>
+        </w:drawing>
+      </w:r>
+    </w:p>
+    <w:p>
+      <w:pPr>
+        <w:pStyle w:val="Caption"/>
+      </w:pPr>
+      <w:r>
+        <w:t xml:space="preserve">Figure </w:t>
+      </w:r>
+      <w:fldSimple w:instr=" SEQ Figure \* ARABIC ">
+        <w:r>
+          <w:rPr>
+            <w:noProof/>
+          </w:rPr>
+          <w:t>28</w:t>
+        </w:r>
+      </w:fldSimple>
+      <w:r>
+        <w:t xml:space="preserve"> - Risk status and Gender correlation before data clean</w:t>
+      </w:r>
+    </w:p>
+    <w:p>
+      <w:pPr>
+        <w:pStyle w:val="Caption"/>
+      </w:pPr>
+      <w:r>
+        <w:t>Source - Author</w:t>
+      </w:r>
+    </w:p>
+    <w:p>
+      <w:pPr>
+        <w:keepNext/>
+        <w:jc w:val="center"/>
+      </w:pPr>
+      <w:r>
+        <w:drawing>
+          <wp:inline distT="0" distB="0" distL="0" distR="0" wp14:anchorId="0AAD340B" wp14:editId="687FD1EC">
+            <wp:extent cx="2946886" cy="2312859"/>
+            <wp:effectExtent l="0" t="0" r="6350" b="0"/>
+            <wp:docPr id="2008570773" name="Picture 1"/>
+            <wp:cNvGraphicFramePr>
+              <a:graphicFrameLocks xmlns:a="http://schemas.openxmlformats.org/drawingml/2006/main" noChangeAspect="1"/>
+            </wp:cNvGraphicFramePr>
+            <a:graphic xmlns:a="http://schemas.openxmlformats.org/drawingml/2006/main">
+              <a:graphicData uri="http://schemas.openxmlformats.org/drawingml/2006/picture">
+                <pic:pic xmlns:pic="http://schemas.openxmlformats.org/drawingml/2006/picture">
+                  <pic:nvPicPr>
+                    <pic:cNvPr id="2008570773" name=""/>
+                    <pic:cNvPicPr/>
+                  </pic:nvPicPr>
+                  <pic:blipFill>
+                    <a:blip r:embed="rId40"/>
+                    <a:stretch>
+                      <a:fillRect/>
+                    </a:stretch>
+                  </pic:blipFill>
+                  <pic:spPr>
+                    <a:xfrm>
+                      <a:off x="0" y="0"/>
+                      <a:ext cx="2969495" cy="2330603"/>
+                    </a:xfrm>
+                    <a:prstGeom prst="rect">
+                      <a:avLst/>
+                    </a:prstGeom>
+                  </pic:spPr>
+                </pic:pic>
+              </a:graphicData>
+            </a:graphic>
+          </wp:inline>
+        </w:drawing>
+      </w:r>
+    </w:p>
+    <w:p>
+      <w:pPr>
+        <w:pStyle w:val="Caption"/>
+      </w:pPr>
+      <w:r>
+        <w:t xml:space="preserve">Figure </w:t>
+      </w:r>
+      <w:fldSimple w:instr=" SEQ Figure \* ARABIC ">
+        <w:r>
+          <w:rPr>
+            <w:noProof/>
+          </w:rPr>
+          <w:t>29</w:t>
+        </w:r>
+      </w:fldSimple>
+      <w:r>
+        <w:t xml:space="preserve"> - Risk status and gender correlations after data clean</w:t>
+      </w:r>
+    </w:p>
+    <w:p>
+      <w:pPr>
+        <w:pStyle w:val="Caption"/>
+      </w:pPr>
+      <w:r>
+        <w:t xml:space="preserve">Source </w:t>
+      </w:r>
+      <w:r>
+        <w:t>–</w:t>
+      </w:r>
+      <w:r>
+        <w:t xml:space="preserve"> Author</w:t>
+      </w:r>
+    </w:p>
+    <w:p>
+      <w:r>
+        <w:br w:type="page"/>
+      </w:r>
+    </w:p>
+    <w:p>
+      <w:pPr>
+        <w:pStyle w:val="Heading1"/>
+      </w:pPr>
+      <w:r>
+        <w:lastRenderedPageBreak/>
+        <w:t xml:space="preserve">Question 9: </w:t>
+      </w:r>
+      <w:r>
+        <w:t>Scatter Plot</w:t>
+      </w:r>
+    </w:p>
+    <w:p>
+      <w:r>
+        <w:t xml:space="preserve">The expected outcome of </w:t>
+      </w:r>
+      <w:r>
+        <w:t xml:space="preserve">scatter plot was not found within this dataset. That is, as cholesterol increases the systolic BP of </w:t>
+      </w:r>
+      <w:r>
+        <w:t xml:space="preserve">person should also increase </w:t>
+      </w:r>
+      <w:r>
+        <w:fldChar w:fldCharType="begin"/>
+      </w:r>
+      <w:r>
+        <w:instrText xml:space="preserve"> ADDIN ZOTERO_ITEM CSL_CITATION {"citationID":"ZQoOglK8","properties":{"unsorted":false,"formattedCitation":"(American Heart Foundation, 2026)","plainCitation":"(American Heart Foundation, 2026)","noteIndex":0},"citationItems":[{"id":11,"uris":["http://zotero.org/users/local/ZgM2QhaK/items/3PQR3QPG"],"itemData":{"id":11,"type":"webpage","abstract":"&amp;nbsp;","container-title":"www.heart.org","language":"en","title":"What Is Cholesterol?","URL":"https://www.heart.org/en/health-topics/cholesterol/about-cholesterol","author":[{"literal":"American Heart Foundation"}],"accessed":{"date-parts":[["2026",4,6]]},"issued":{"date-parts":[["2026",3,13]]}}}],"schema":"https://github.com/citation-style-language/schema/raw/master/csl-citation.json"} </w:instrText>
+      </w:r>
+      <w:r>
+        <w:fldChar w:fldCharType="separate"/>
+      </w:r>
+      <w:r>
+        <w:rPr>
+          <w:rFonts w:ascii="Aptos" w:hAnsi="Aptos"/>
+        </w:rPr>
+        <w:t>(American Heart Foundation, 2026)</w:t>
+      </w:r>
+      <w:r>
+        <w:fldChar w:fldCharType="end"/>
+      </w:r>
+      <w:r>
+        <w:t>.</w:t>
+      </w:r>
+      <w:r>
+        <w:t xml:space="preserve"> The actual outcome within the </w:t>
+      </w:r>
+      <w:r>
+        <w:t xml:space="preserve">dataset was that there is a random correleation </w:t>
+      </w:r>
+      <w:r>
+        <w:t xml:space="preserve">between a person’s cholesterol and their systolic BP. </w:t>
+      </w:r>
+      <w:r>
+        <w:t>The average cholesterol can be seen hovering around the 50 mark.</w:t>
+      </w:r>
+    </w:p>
+    <w:p>
+      <w:pPr>
+        <w:keepNext/>
+        <w:jc w:val="center"/>
+      </w:pPr>
+      <w:r>
+        <w:drawing>
+          <wp:inline distT="0" distB="0" distL="0" distR="0" wp14:anchorId="6A52ACB1" wp14:editId="347F66AE">
+            <wp:extent cx="4210685" cy="1491887"/>
+            <wp:effectExtent l="0" t="0" r="0" b="0"/>
+            <wp:docPr id="652389275" name="Picture 1"/>
+            <wp:cNvGraphicFramePr>
+              <a:graphicFrameLocks xmlns:a="http://schemas.openxmlformats.org/drawingml/2006/main" noChangeAspect="1"/>
+            </wp:cNvGraphicFramePr>
+            <a:graphic xmlns:a="http://schemas.openxmlformats.org/drawingml/2006/main">
+              <a:graphicData uri="http://schemas.openxmlformats.org/drawingml/2006/picture">
+                <pic:pic xmlns:pic="http://schemas.openxmlformats.org/drawingml/2006/picture">
+                  <pic:nvPicPr>
+                    <pic:cNvPr id="652389275" name=""/>
+                    <pic:cNvPicPr/>
+                  </pic:nvPicPr>
+                  <pic:blipFill>
+                    <a:blip r:embed="rId41"/>
+                    <a:stretch>
+                      <a:fillRect/>
+                    </a:stretch>
+                  </pic:blipFill>
+                  <pic:spPr>
+                    <a:xfrm>
+                      <a:off x="0" y="0"/>
+                      <a:ext cx="4221960" cy="1495882"/>
+                    </a:xfrm>
+                    <a:prstGeom prst="rect">
+                      <a:avLst/>
+                    </a:prstGeom>
+                  </pic:spPr>
+                </pic:pic>
+              </a:graphicData>
+            </a:graphic>
+          </wp:inline>
+        </w:drawing>
+      </w:r>
+    </w:p>
+    <w:p>
+      <w:pPr>
+        <w:pStyle w:val="Caption"/>
+      </w:pPr>
+      <w:r>
+        <w:t xml:space="preserve">Figure </w:t>
+      </w:r>
+      <w:fldSimple w:instr=" SEQ Figure \* ARABIC ">
+        <w:r>
+          <w:rPr>
+            <w:noProof/>
+          </w:rPr>
+          <w:t>30</w:t>
+        </w:r>
+      </w:fldSimple>
+      <w:r>
+        <w:t xml:space="preserve"> - Code to create the Scatter Plot</w:t>
+      </w:r>
+    </w:p>
+    <w:p>
+      <w:pPr>
+        <w:pStyle w:val="Caption"/>
+      </w:pPr>
+      <w:r>
+        <w:t>Source - Author</w:t>
+      </w:r>
+    </w:p>
+    <w:p>
+      <w:pPr>
+        <w:keepNext/>
+      </w:pPr>
+      <w:r>
+        <w:drawing>
+          <wp:inline distT="0" distB="0" distL="0" distR="0" wp14:anchorId="5BEBECF5" wp14:editId="41AA9840">
+            <wp:extent cx="3385457" cy="2739947"/>
+            <wp:effectExtent l="0" t="0" r="5715" b="3810"/>
+            <wp:docPr id="1412429855" name="Picture 1"/>
+            <wp:cNvGraphicFramePr>
+              <a:graphicFrameLocks xmlns:a="http://schemas.openxmlformats.org/drawingml/2006/main" noChangeAspect="1"/>
+            </wp:cNvGraphicFramePr>
+            <a:graphic xmlns:a="http://schemas.openxmlformats.org/drawingml/2006/main">
+              <a:graphicData uri="http://schemas.openxmlformats.org/drawingml/2006/picture">
+                <pic:pic xmlns:pic="http://schemas.openxmlformats.org/drawingml/2006/picture">
+                  <pic:nvPicPr>
+                    <pic:cNvPr id="1412429855" name=""/>
+                    <pic:cNvPicPr/>
+                  </pic:nvPicPr>
+                  <pic:blipFill>
+                    <a:blip r:embed="rId42"/>
+                    <a:stretch>
+                      <a:fillRect/>
+                    </a:stretch>
+                  </pic:blipFill>
+                  <pic:spPr>
+                    <a:xfrm>
+                      <a:off x="0" y="0"/>
+                      <a:ext cx="3400878" cy="2752428"/>
+                    </a:xfrm>
+                    <a:prstGeom prst="rect">
+                      <a:avLst/>
+                    </a:prstGeom>
+                  </pic:spPr>
+                </pic:pic>
+              </a:graphicData>
+            </a:graphic>
+          </wp:inline>
+        </w:drawing>
+      </w:r>
+    </w:p>
+    <w:p>
+      <w:pPr>
+        <w:pStyle w:val="Caption"/>
+      </w:pPr>
+      <w:r>
+        <w:t xml:space="preserve">Figure </w:t>
+      </w:r>
+      <w:fldSimple w:instr=" SEQ Figure \* ARABIC ">
+        <w:r>
+          <w:rPr>
+            <w:noProof/>
+          </w:rPr>
+          <w:t>31</w:t>
+        </w:r>
+      </w:fldSimple>
+      <w:r>
+        <w:t xml:space="preserve"> - Scatter plot of Cholesterol vs Systolic BP after data clean</w:t>
+      </w:r>
+    </w:p>
+    <w:p>
+      <w:pPr>
+        <w:pStyle w:val="Caption"/>
+      </w:pPr>
+      <w:r>
+        <w:t>Source - Author</w:t>
+      </w:r>
+    </w:p>
+    <w:p>
+      <w:pPr>
+        <w:pStyle w:val="Heading1"/>
+      </w:pPr>
+      <w:r>
         <w:t>Question 10: Working with Health Data</w:t>
       </w:r>
     </w:p>
@@ -2062,6 +3186,7 @@
     </w:p>
     <w:p>
       <w:r>
+        <w:lastRenderedPageBreak/>
         <w:t xml:space="preserve">Data security </w:t>
       </w:r>
       <w:r>
@@ -2118,6 +3243,45 @@
     </w:sectPr>
   </w:body>
 </w:document>
+</file>
+
+<file path=word/comments.xml><?xml version="1.0" encoding="utf-8"?>
+<w:comments xmlns:wpc="http://schemas.microsoft.com/office/word/2010/wordprocessingCanvas" xmlns:cx="http://schemas.microsoft.com/office/drawing/2014/chartex" xmlns:cx1="http://schemas.microsoft.com/office/drawing/2015/9/8/chartex" xmlns:cx2="http://schemas.microsoft.com/office/drawing/2015/10/21/chartex" xmlns:cx3="http://schemas.microsoft.com/office/drawing/2016/5/9/chartex" xmlns:cx4="http://schemas.microsoft.com/office/drawing/2016/5/10/chartex" xmlns:cx5="http://schemas.microsoft.com/office/drawing/2016/5/11/chartex" xmlns:cx6="http://schemas.microsoft.com/office/drawing/2016/5/12/chartex" xmlns:cx7="http://schemas.microsoft.com/office/drawing/2016/5/13/chartex" xmlns:cx8="http://schemas.microsoft.com/office/drawing/2016/5/14/chartex" xmlns:mc="http://schemas.openxmlformats.org/markup-compatibility/2006" xmlns:aink="http://schemas.microsoft.com/office/drawing/2016/ink" xmlns:am3d="http://schemas.microsoft.com/office/drawing/2017/model3d" xmlns:o="urn:schemas-microsoft-com:office:office" xmlns:oel="http://schemas.microsoft.com/office/2019/extlst" xmlns:r="http://schemas.openxmlformats.org/officeDocument/2006/relationships" xmlns:m="http://schemas.openxmlformats.org/officeDocument/2006/math" xmlns:v="urn:schemas-microsoft-com:vml" xmlns:wp14="http://schemas.microsoft.com/office/word/2010/wordprocessingDrawing" xmlns:wp="http://schemas.openxmlformats.org/drawingml/2006/wordprocessingDrawing" xmlns:w10="urn:schemas-microsoft-com:office:word" xmlns:w="http://schemas.openxmlformats.org/wordprocessingml/2006/main" xmlns:w14="http://schemas.microsoft.com/office/word/2010/wordml" xmlns:w15="http://schemas.microsoft.com/office/word/2012/wordml" xmlns:w16cex="http://schemas.microsoft.com/office/word/2018/wordml/cex" xmlns:w16cid="http://schemas.microsoft.com/office/word/2016/wordml/cid" xmlns:w16="http://schemas.microsoft.com/office/word/2018/wordml" xmlns:w16du="http://schemas.microsoft.com/office/word/2023/wordml/word16du" xmlns:w16sdtdh="http://schemas.microsoft.com/office/word/2020/wordml/sdtdatahash" xmlns:w16sdtfl="http://schemas.microsoft.com/office/word/2024/wordml/sdtformatlock" xmlns:w16se="http://schemas.microsoft.com/office/word/2015/wordml/symex" xmlns:wpg="http://schemas.microsoft.com/office/word/2010/wordprocessingGroup" xmlns:wpi="http://schemas.microsoft.com/office/word/2010/wordprocessingInk" xmlns:wne="http://schemas.microsoft.com/office/word/2006/wordml" xmlns:wps="http://schemas.microsoft.com/office/word/2010/wordprocessingShape" mc:Ignorable="w14 w15 w16se w16cid w16 w16cex w16sdtdh w16sdtfl w16du wp14">
+  <w:comment w:id="0" w:author="Lachlan Wyer" w:date="2026-04-06T11:44:00Z" w:initials="LW">
+    <w:p>
+      <w:pPr>
+        <w:pStyle w:val="CommentText"/>
+      </w:pPr>
+      <w:r>
+        <w:rPr>
+          <w:rStyle w:val="CommentReference"/>
+        </w:rPr>
+        <w:annotationRef/>
+      </w:r>
+      <w:r>
+        <w:t>Check how in depth they want the analysis</w:t>
+      </w:r>
+    </w:p>
+  </w:comment>
+</w:comments>
+</file>
+
+<file path=word/commentsExtended.xml><?xml version="1.0" encoding="utf-8"?>
+<w15:commentsEx xmlns:wpc="http://schemas.microsoft.com/office/word/2010/wordprocessingCanvas" xmlns:cx="http://schemas.microsoft.com/office/drawing/2014/chartex" xmlns:cx1="http://schemas.microsoft.com/office/drawing/2015/9/8/chartex" xmlns:cx2="http://schemas.microsoft.com/office/drawing/2015/10/21/chartex" xmlns:cx3="http://schemas.microsoft.com/office/drawing/2016/5/9/chartex" xmlns:cx4="http://schemas.microsoft.com/office/drawing/2016/5/10/chartex" xmlns:cx5="http://schemas.microsoft.com/office/drawing/2016/5/11/chartex" xmlns:cx6="http://schemas.microsoft.com/office/drawing/2016/5/12/chartex" xmlns:cx7="http://schemas.microsoft.com/office/drawing/2016/5/13/chartex" xmlns:cx8="http://schemas.microsoft.com/office/drawing/2016/5/14/chartex" xmlns:mc="http://schemas.openxmlformats.org/markup-compatibility/2006" xmlns:aink="http://schemas.microsoft.com/office/drawing/2016/ink" xmlns:am3d="http://schemas.microsoft.com/office/drawing/2017/model3d" xmlns:o="urn:schemas-microsoft-com:office:office" xmlns:oel="http://schemas.microsoft.com/office/2019/extlst" xmlns:r="http://schemas.openxmlformats.org/officeDocument/2006/relationships" xmlns:m="http://schemas.openxmlformats.org/officeDocument/2006/math" xmlns:v="urn:schemas-microsoft-com:vml" xmlns:wp14="http://schemas.microsoft.com/office/word/2010/wordprocessingDrawing" xmlns:wp="http://schemas.openxmlformats.org/drawingml/2006/wordprocessingDrawing" xmlns:w10="urn:schemas-microsoft-com:office:word" xmlns:w="http://schemas.openxmlformats.org/wordprocessingml/2006/main" xmlns:w14="http://schemas.microsoft.com/office/word/2010/wordml" xmlns:w15="http://schemas.microsoft.com/office/word/2012/wordml" xmlns:w16cex="http://schemas.microsoft.com/office/word/2018/wordml/cex" xmlns:w16cid="http://schemas.microsoft.com/office/word/2016/wordml/cid" xmlns:w16="http://schemas.microsoft.com/office/word/2018/wordml" xmlns:w16du="http://schemas.microsoft.com/office/word/2023/wordml/word16du" xmlns:w16sdtdh="http://schemas.microsoft.com/office/word/2020/wordml/sdtdatahash" xmlns:w16sdtfl="http://schemas.microsoft.com/office/word/2024/wordml/sdtformatlock" xmlns:w16se="http://schemas.microsoft.com/office/word/2015/wordml/symex" xmlns:wpg="http://schemas.microsoft.com/office/word/2010/wordprocessingGroup" xmlns:wpi="http://schemas.microsoft.com/office/word/2010/wordprocessingInk" xmlns:wne="http://schemas.microsoft.com/office/word/2006/wordml" xmlns:wps="http://schemas.microsoft.com/office/word/2010/wordprocessingShape" mc:Ignorable="w14 w15 w16se w16cid w16 w16cex w16sdtdh w16sdtfl w16du wp14">
+  <w15:commentEx w15:paraId="39E1C048" w15:done="0"/>
+</w15:commentsEx>
+</file>
+
+<file path=word/commentsExtensible.xml><?xml version="1.0" encoding="utf-8"?>
+<w16cex:commentsExtensible xmlns:wpc="http://schemas.microsoft.com/office/word/2010/wordprocessingCanvas" xmlns:cx="http://schemas.microsoft.com/office/drawing/2014/chartex" xmlns:cx1="http://schemas.microsoft.com/office/drawing/2015/9/8/chartex" xmlns:cx2="http://schemas.microsoft.com/office/drawing/2015/10/21/chartex" xmlns:cx3="http://schemas.microsoft.com/office/drawing/2016/5/9/chartex" xmlns:cx4="http://schemas.microsoft.com/office/drawing/2016/5/10/chartex" xmlns:cx5="http://schemas.microsoft.com/office/drawing/2016/5/11/chartex" xmlns:cx6="http://schemas.microsoft.com/office/drawing/2016/5/12/chartex" xmlns:cx7="http://schemas.microsoft.com/office/drawing/2016/5/13/chartex" xmlns:cx8="http://schemas.microsoft.com/office/drawing/2016/5/14/chartex" xmlns:cr="http://schemas.microsoft.com/office/comments/2020/reactions" xmlns:mc="http://schemas.openxmlformats.org/markup-compatibility/2006" xmlns:aink="http://schemas.microsoft.com/office/drawing/2016/ink" xmlns:am3d="http://schemas.microsoft.com/office/drawing/2017/model3d" xmlns:o="urn:schemas-microsoft-com:office:office" xmlns:oel="http://schemas.microsoft.com/office/2019/extlst" xmlns:r="http://schemas.openxmlformats.org/officeDocument/2006/relationships" xmlns:m="http://schemas.openxmlformats.org/officeDocument/2006/math" xmlns:v="urn:schemas-microsoft-com:vml" xmlns:wp14="http://schemas.microsoft.com/office/word/2010/wordprocessingDrawing" xmlns:wp="http://schemas.openxmlformats.org/drawingml/2006/wordprocessingDrawing" xmlns:w10="urn:schemas-microsoft-com:office:word" xmlns:w="http://schemas.openxmlformats.org/wordprocessingml/2006/main" xmlns:w14="http://schemas.microsoft.com/office/word/2010/wordml" xmlns:w15="http://schemas.microsoft.com/office/word/2012/wordml" xmlns:w16cex="http://schemas.microsoft.com/office/word/2018/wordml/cex" xmlns:w16cid="http://schemas.microsoft.com/office/word/2016/wordml/cid" xmlns:w16="http://schemas.microsoft.com/office/word/2018/wordml" xmlns:w16du="http://schemas.microsoft.com/office/word/2023/wordml/word16du" xmlns:w16sdtdh="http://schemas.microsoft.com/office/word/2020/wordml/sdtdatahash" xmlns:w16sdtfl="http://schemas.microsoft.com/office/word/2024/wordml/sdtformatlock" xmlns:w16se="http://schemas.microsoft.com/office/word/2015/wordml/symex" xmlns:wpg="http://schemas.microsoft.com/office/word/2010/wordprocessingGroup" xmlns:wpi="http://schemas.microsoft.com/office/word/2010/wordprocessingInk" xmlns:wne="http://schemas.microsoft.com/office/word/2006/wordml" xmlns:wps="http://schemas.microsoft.com/office/word/2010/wordprocessingShape" mc:Ignorable="w14 w15 w16se w16cid w16 w16cex w16sdtdh w16sdtfl cr w16du wp14">
+  <w16cex:commentExtensible w16cex:durableId="5A2F50C7" w16cex:dateUtc="2026-04-06T01:44:00Z"/>
+</w16cex:commentsExtensible>
+</file>
+
+<file path=word/commentsIds.xml><?xml version="1.0" encoding="utf-8"?>
+<w16cid:commentsIds xmlns:wpc="http://schemas.microsoft.com/office/word/2010/wordprocessingCanvas" xmlns:cx="http://schemas.microsoft.com/office/drawing/2014/chartex" xmlns:cx1="http://schemas.microsoft.com/office/drawing/2015/9/8/chartex" xmlns:cx2="http://schemas.microsoft.com/office/drawing/2015/10/21/chartex" xmlns:cx3="http://schemas.microsoft.com/office/drawing/2016/5/9/chartex" xmlns:cx4="http://schemas.microsoft.com/office/drawing/2016/5/10/chartex" xmlns:cx5="http://schemas.microsoft.com/office/drawing/2016/5/11/chartex" xmlns:cx6="http://schemas.microsoft.com/office/drawing/2016/5/12/chartex" xmlns:cx7="http://schemas.microsoft.com/office/drawing/2016/5/13/chartex" xmlns:cx8="http://schemas.microsoft.com/office/drawing/2016/5/14/chartex" xmlns:mc="http://schemas.openxmlformats.org/markup-compatibility/2006" xmlns:aink="http://schemas.microsoft.com/office/drawing/2016/ink" xmlns:am3d="http://schemas.microsoft.com/office/drawing/2017/model3d" xmlns:o="urn:schemas-microsoft-com:office:office" xmlns:oel="http://schemas.microsoft.com/office/2019/extlst" xmlns:r="http://schemas.openxmlformats.org/officeDocument/2006/relationships" xmlns:m="http://schemas.openxmlformats.org/officeDocument/2006/math" xmlns:v="urn:schemas-microsoft-com:vml" xmlns:wp14="http://schemas.microsoft.com/office/word/2010/wordprocessingDrawing" xmlns:wp="http://schemas.openxmlformats.org/drawingml/2006/wordprocessingDrawing" xmlns:w10="urn:schemas-microsoft-com:office:word" xmlns:w="http://schemas.openxmlformats.org/wordprocessingml/2006/main" xmlns:w14="http://schemas.microsoft.com/office/word/2010/wordml" xmlns:w15="http://schemas.microsoft.com/office/word/2012/wordml" xmlns:w16cex="http://schemas.microsoft.com/office/word/2018/wordml/cex" xmlns:w16cid="http://schemas.microsoft.com/office/word/2016/wordml/cid" xmlns:w16="http://schemas.microsoft.com/office/word/2018/wordml" xmlns:w16du="http://schemas.microsoft.com/office/word/2023/wordml/word16du" xmlns:w16sdtdh="http://schemas.microsoft.com/office/word/2020/wordml/sdtdatahash" xmlns:w16sdtfl="http://schemas.microsoft.com/office/word/2024/wordml/sdtformatlock" xmlns:w16se="http://schemas.microsoft.com/office/word/2015/wordml/symex" xmlns:wpg="http://schemas.microsoft.com/office/word/2010/wordprocessingGroup" xmlns:wpi="http://schemas.microsoft.com/office/word/2010/wordprocessingInk" xmlns:wne="http://schemas.microsoft.com/office/word/2006/wordml" xmlns:wps="http://schemas.microsoft.com/office/word/2010/wordprocessingShape" mc:Ignorable="w14 w15 w16se w16cid w16 w16cex w16sdtdh w16sdtfl w16du wp14">
+  <w16cid:commentId w16cid:paraId="39E1C048" w16cid:durableId="5A2F50C7"/>
+</w16cid:commentsIds>
 </file>
 
 <file path=word/numbering.xml><?xml version="1.0" encoding="utf-8"?>
@@ -2238,6 +3402,14 @@
     <w:abstractNumId w:val="0"/>
   </w:num>
 </w:numbering>
+</file>
+
+<file path=word/people.xml><?xml version="1.0" encoding="utf-8"?>
+<w15:people xmlns:wpc="http://schemas.microsoft.com/office/word/2010/wordprocessingCanvas" xmlns:cx="http://schemas.microsoft.com/office/drawing/2014/chartex" xmlns:cx1="http://schemas.microsoft.com/office/drawing/2015/9/8/chartex" xmlns:cx2="http://schemas.microsoft.com/office/drawing/2015/10/21/chartex" xmlns:cx3="http://schemas.microsoft.com/office/drawing/2016/5/9/chartex" xmlns:cx4="http://schemas.microsoft.com/office/drawing/2016/5/10/chartex" xmlns:cx5="http://schemas.microsoft.com/office/drawing/2016/5/11/chartex" xmlns:cx6="http://schemas.microsoft.com/office/drawing/2016/5/12/chartex" xmlns:cx7="http://schemas.microsoft.com/office/drawing/2016/5/13/chartex" xmlns:cx8="http://schemas.microsoft.com/office/drawing/2016/5/14/chartex" xmlns:mc="http://schemas.openxmlformats.org/markup-compatibility/2006" xmlns:aink="http://schemas.microsoft.com/office/drawing/2016/ink" xmlns:am3d="http://schemas.microsoft.com/office/drawing/2017/model3d" xmlns:o="urn:schemas-microsoft-com:office:office" xmlns:oel="http://schemas.microsoft.com/office/2019/extlst" xmlns:r="http://schemas.openxmlformats.org/officeDocument/2006/relationships" xmlns:m="http://schemas.openxmlformats.org/officeDocument/2006/math" xmlns:v="urn:schemas-microsoft-com:vml" xmlns:wp14="http://schemas.microsoft.com/office/word/2010/wordprocessingDrawing" xmlns:wp="http://schemas.openxmlformats.org/drawingml/2006/wordprocessingDrawing" xmlns:w10="urn:schemas-microsoft-com:office:word" xmlns:w="http://schemas.openxmlformats.org/wordprocessingml/2006/main" xmlns:w14="http://schemas.microsoft.com/office/word/2010/wordml" xmlns:w15="http://schemas.microsoft.com/office/word/2012/wordml" xmlns:w16cex="http://schemas.microsoft.com/office/word/2018/wordml/cex" xmlns:w16cid="http://schemas.microsoft.com/office/word/2016/wordml/cid" xmlns:w16="http://schemas.microsoft.com/office/word/2018/wordml" xmlns:w16du="http://schemas.microsoft.com/office/word/2023/wordml/word16du" xmlns:w16sdtdh="http://schemas.microsoft.com/office/word/2020/wordml/sdtdatahash" xmlns:w16sdtfl="http://schemas.microsoft.com/office/word/2024/wordml/sdtformatlock" xmlns:w16se="http://schemas.microsoft.com/office/word/2015/wordml/symex" xmlns:wpg="http://schemas.microsoft.com/office/word/2010/wordprocessingGroup" xmlns:wpi="http://schemas.microsoft.com/office/word/2010/wordprocessingInk" xmlns:wne="http://schemas.microsoft.com/office/word/2006/wordml" xmlns:wps="http://schemas.microsoft.com/office/word/2010/wordprocessingShape" mc:Ignorable="w14 w15 w16se w16cid w16 w16cex w16sdtdh w16sdtfl w16du wp14">
+  <w15:person w15:author="Lachlan Wyer">
+    <w15:presenceInfo w15:providerId="AD" w15:userId="S::lachlan.wyer@cqumail.com::3173a9f1-b9fb-4d08-92dd-14118bb596d9"/>
+  </w15:person>
+</w15:people>
 </file>
 
 <file path=word/styles.xml><?xml version="1.0" encoding="utf-8"?>
@@ -2826,7 +3998,6 @@
     <w:basedOn w:val="Normal"/>
     <w:link w:val="CommentTextChar"/>
     <w:uiPriority w:val="99"/>
-    <w:semiHidden/>
     <w:unhideWhenUsed/>
     <w:rsid w:val="005E4CD2"/>
     <w:pPr>
@@ -2842,7 +4013,6 @@
     <w:basedOn w:val="DefaultParagraphFont"/>
     <w:link w:val="CommentText"/>
     <w:uiPriority w:val="99"/>
-    <w:semiHidden/>
     <w:rsid w:val="005E4CD2"/>
     <w:rPr>
       <w:sz w:val="20"/>

</xml_diff>

<commit_message>
Cleaned files and added an ignore list
</commit_message>
<xml_diff>
--- a/Work/Assignment 1 - Draft 3.docx
+++ b/Work/Assignment 1 - Draft 3.docx
@@ -147,14 +147,27 @@
       <w:r>
         <w:t xml:space="preserve">Figure </w:t>
       </w:r>
-      <w:fldSimple w:instr=" SEQ Figure \* ARABIC ">
-        <w:r>
-          <w:rPr>
-            <w:noProof/>
-          </w:rPr>
-          <w:t>1</w:t>
-        </w:r>
-      </w:fldSimple>
+      <w:r>
+        <w:fldChar w:fldCharType="begin"/>
+      </w:r>
+      <w:r>
+        <w:instrText xml:space="preserve"> SEQ Figure \* ARABIC </w:instrText>
+      </w:r>
+      <w:r>
+        <w:fldChar w:fldCharType="separate"/>
+      </w:r>
+      <w:r>
+        <w:rPr>
+          <w:noProof/>
+        </w:rPr>
+        <w:t>1</w:t>
+      </w:r>
+      <w:r>
+        <w:rPr>
+          <w:noProof/>
+        </w:rPr>
+        <w:fldChar w:fldCharType="end"/>
+      </w:r>
       <w:r>
         <w:t xml:space="preserve"> - Initial TUI that is present for </w:t>
       </w:r>
@@ -229,14 +242,27 @@
       <w:r>
         <w:t xml:space="preserve">Figure </w:t>
       </w:r>
-      <w:fldSimple w:instr=" SEQ Figure \* ARABIC ">
-        <w:r>
-          <w:rPr>
-            <w:noProof/>
-          </w:rPr>
-          <w:t>2</w:t>
-        </w:r>
-      </w:fldSimple>
+      <w:r>
+        <w:fldChar w:fldCharType="begin"/>
+      </w:r>
+      <w:r>
+        <w:instrText xml:space="preserve"> SEQ Figure \* ARABIC </w:instrText>
+      </w:r>
+      <w:r>
+        <w:fldChar w:fldCharType="separate"/>
+      </w:r>
+      <w:r>
+        <w:rPr>
+          <w:noProof/>
+        </w:rPr>
+        <w:t>2</w:t>
+      </w:r>
+      <w:r>
+        <w:rPr>
+          <w:noProof/>
+        </w:rPr>
+        <w:fldChar w:fldCharType="end"/>
+      </w:r>
       <w:r>
         <w:t xml:space="preserve"> - Code to create the TUI and check value</w:t>
       </w:r>
@@ -249,7 +275,34 @@
         <w:pStyle w:val="Caption"/>
       </w:pPr>
       <w:r>
-        <w:t>Source - Author</w:t>
+        <w:t xml:space="preserve">Source </w:t>
+      </w:r>
+      <w:r>
+        <w:t>–</w:t>
+      </w:r>
+      <w:r>
+        <w:t xml:space="preserve"> Author</w:t>
+      </w:r>
+      <w:r>
+        <w:t xml:space="preserve"> </w:t>
+      </w:r>
+      <w:r>
+        <w:fldChar w:fldCharType="begin"/>
+      </w:r>
+      <w:r>
+        <w:instrText xml:space="preserve"> ADDIN ZOTERO_ITEM CSL_CITATION {"citationID":"22c4yggI","properties":{"unsorted":false,"formattedCitation":"(Wyer, n.d.)","plainCitation":"(Wyer, n.d.)","noteIndex":0},"citationItems":[{"id":43,"uris":["http://zotero.org/users/local/ZgM2QhaK/items/Z3DAWWGG"],"itemData":{"id":43,"type":"software","genre":"python","license":"GPL-v3","medium":"Windows, Linux, Unix","title":"Python-Pandas","URL":"https://github.com/BayElectrician/Python-Pandas","version":"0.0.1","author":[{"family":"Wyer","given":"Lachlan"}],"accessed":{"date-parts":[["2026",4,8]]}}}],"schema":"https://github.com/citation-style-language/schema/raw/master/csl-citation.json"} </w:instrText>
+      </w:r>
+      <w:r>
+        <w:fldChar w:fldCharType="separate"/>
+      </w:r>
+      <w:r>
+        <w:rPr>
+          <w:rFonts w:ascii="Aptos" w:hAnsi="Aptos"/>
+        </w:rPr>
+        <w:t>(Wyer, n.d.)</w:t>
+      </w:r>
+      <w:r>
+        <w:fldChar w:fldCharType="end"/>
       </w:r>
     </w:p>
     <w:p>
@@ -306,14 +359,27 @@
       <w:r>
         <w:t xml:space="preserve">Figure </w:t>
       </w:r>
-      <w:fldSimple w:instr=" SEQ Figure \* ARABIC ">
-        <w:r>
-          <w:rPr>
-            <w:noProof/>
-          </w:rPr>
-          <w:t>3</w:t>
-        </w:r>
-      </w:fldSimple>
+      <w:r>
+        <w:fldChar w:fldCharType="begin"/>
+      </w:r>
+      <w:r>
+        <w:instrText xml:space="preserve"> SEQ Figure \* ARABIC </w:instrText>
+      </w:r>
+      <w:r>
+        <w:fldChar w:fldCharType="separate"/>
+      </w:r>
+      <w:r>
+        <w:rPr>
+          <w:noProof/>
+        </w:rPr>
+        <w:t>3</w:t>
+      </w:r>
+      <w:r>
+        <w:rPr>
+          <w:noProof/>
+        </w:rPr>
+        <w:fldChar w:fldCharType="end"/>
+      </w:r>
       <w:r>
         <w:t xml:space="preserve"> - Code that calls the </w:t>
       </w:r>
@@ -342,6 +408,27 @@
       </w:pPr>
       <w:r>
         <w:t>Source – Author</w:t>
+      </w:r>
+      <w:r>
+        <w:t xml:space="preserve"> </w:t>
+      </w:r>
+      <w:r>
+        <w:fldChar w:fldCharType="begin"/>
+      </w:r>
+      <w:r>
+        <w:instrText xml:space="preserve"> ADDIN ZOTERO_ITEM CSL_CITATION {"citationID":"VeQJsBSs","properties":{"unsorted":false,"formattedCitation":"(Wyer, n.d.)","plainCitation":"(Wyer, n.d.)","noteIndex":0},"citationItems":[{"id":43,"uris":["http://zotero.org/users/local/ZgM2QhaK/items/Z3DAWWGG"],"itemData":{"id":43,"type":"software","genre":"python","license":"GPL-v3","medium":"Windows, Linux, Unix","title":"Python-Pandas","URL":"https://github.com/BayElectrician/Python-Pandas","version":"0.0.1","author":[{"family":"Wyer","given":"Lachlan"}],"accessed":{"date-parts":[["2026",4,8]]}}}],"schema":"https://github.com/citation-style-language/schema/raw/master/csl-citation.json"} </w:instrText>
+      </w:r>
+      <w:r>
+        <w:fldChar w:fldCharType="separate"/>
+      </w:r>
+      <w:r>
+        <w:rPr>
+          <w:rFonts w:ascii="Aptos" w:hAnsi="Aptos"/>
+        </w:rPr>
+        <w:t>(Wyer, n.d.)</w:t>
+      </w:r>
+      <w:r>
+        <w:fldChar w:fldCharType="end"/>
       </w:r>
     </w:p>
     <w:p>
@@ -433,14 +520,27 @@
       <w:r>
         <w:t xml:space="preserve">Figure </w:t>
       </w:r>
-      <w:fldSimple w:instr=" SEQ Figure \* ARABIC ">
-        <w:r>
-          <w:rPr>
-            <w:noProof/>
-          </w:rPr>
-          <w:t>4</w:t>
-        </w:r>
-      </w:fldSimple>
+      <w:r>
+        <w:fldChar w:fldCharType="begin"/>
+      </w:r>
+      <w:r>
+        <w:instrText xml:space="preserve"> SEQ Figure \* ARABIC </w:instrText>
+      </w:r>
+      <w:r>
+        <w:fldChar w:fldCharType="separate"/>
+      </w:r>
+      <w:r>
+        <w:rPr>
+          <w:noProof/>
+        </w:rPr>
+        <w:t>4</w:t>
+      </w:r>
+      <w:r>
+        <w:rPr>
+          <w:noProof/>
+        </w:rPr>
+        <w:fldChar w:fldCharType="end"/>
+      </w:r>
       <w:r>
         <w:t xml:space="preserve"> - Code too import the file</w:t>
       </w:r>
@@ -450,7 +550,34 @@
         <w:pStyle w:val="Caption"/>
       </w:pPr>
       <w:r>
-        <w:t>Source - Author</w:t>
+        <w:t xml:space="preserve">Source </w:t>
+      </w:r>
+      <w:r>
+        <w:t>–</w:t>
+      </w:r>
+      <w:r>
+        <w:t xml:space="preserve"> Author</w:t>
+      </w:r>
+      <w:r>
+        <w:t xml:space="preserve"> </w:t>
+      </w:r>
+      <w:r>
+        <w:fldChar w:fldCharType="begin"/>
+      </w:r>
+      <w:r>
+        <w:instrText xml:space="preserve"> ADDIN ZOTERO_ITEM CSL_CITATION {"citationID":"Wve4wGNF","properties":{"unsorted":false,"formattedCitation":"(Wyer, n.d.)","plainCitation":"(Wyer, n.d.)","noteIndex":0},"citationItems":[{"id":43,"uris":["http://zotero.org/users/local/ZgM2QhaK/items/Z3DAWWGG"],"itemData":{"id":43,"type":"software","genre":"python","license":"GPL-v3","medium":"Windows, Linux, Unix","title":"Python-Pandas","URL":"https://github.com/BayElectrician/Python-Pandas","version":"0.0.1","author":[{"family":"Wyer","given":"Lachlan"}],"accessed":{"date-parts":[["2026",4,8]]}}}],"schema":"https://github.com/citation-style-language/schema/raw/master/csl-citation.json"} </w:instrText>
+      </w:r>
+      <w:r>
+        <w:fldChar w:fldCharType="separate"/>
+      </w:r>
+      <w:r>
+        <w:rPr>
+          <w:rFonts w:ascii="Aptos" w:hAnsi="Aptos"/>
+        </w:rPr>
+        <w:t>(Wyer, n.d.)</w:t>
+      </w:r>
+      <w:r>
+        <w:fldChar w:fldCharType="end"/>
       </w:r>
     </w:p>
     <w:p>
@@ -506,14 +633,27 @@
       <w:r>
         <w:t xml:space="preserve">Figure </w:t>
       </w:r>
-      <w:fldSimple w:instr=" SEQ Figure \* ARABIC ">
-        <w:r>
-          <w:rPr>
-            <w:noProof/>
-          </w:rPr>
-          <w:t>5</w:t>
-        </w:r>
-      </w:fldSimple>
+      <w:r>
+        <w:fldChar w:fldCharType="begin"/>
+      </w:r>
+      <w:r>
+        <w:instrText xml:space="preserve"> SEQ Figure \* ARABIC </w:instrText>
+      </w:r>
+      <w:r>
+        <w:fldChar w:fldCharType="separate"/>
+      </w:r>
+      <w:r>
+        <w:rPr>
+          <w:noProof/>
+        </w:rPr>
+        <w:t>5</w:t>
+      </w:r>
+      <w:r>
+        <w:rPr>
+          <w:noProof/>
+        </w:rPr>
+        <w:fldChar w:fldCharType="end"/>
+      </w:r>
       <w:r>
         <w:t xml:space="preserve"> - User TUI of data import</w:t>
       </w:r>
@@ -593,14 +733,27 @@
       <w:r>
         <w:t xml:space="preserve">Figure </w:t>
       </w:r>
-      <w:fldSimple w:instr=" SEQ Figure \* ARABIC ">
-        <w:r>
-          <w:rPr>
-            <w:noProof/>
-          </w:rPr>
-          <w:t>6</w:t>
-        </w:r>
-      </w:fldSimple>
+      <w:r>
+        <w:fldChar w:fldCharType="begin"/>
+      </w:r>
+      <w:r>
+        <w:instrText xml:space="preserve"> SEQ Figure \* ARABIC </w:instrText>
+      </w:r>
+      <w:r>
+        <w:fldChar w:fldCharType="separate"/>
+      </w:r>
+      <w:r>
+        <w:rPr>
+          <w:noProof/>
+        </w:rPr>
+        <w:t>6</w:t>
+      </w:r>
+      <w:r>
+        <w:rPr>
+          <w:noProof/>
+        </w:rPr>
+        <w:fldChar w:fldCharType="end"/>
+      </w:r>
       <w:r>
         <w:t xml:space="preserve">  - Code for displaying number of records and variables</w:t>
       </w:r>
@@ -626,6 +779,27 @@
       </w:r>
       <w:r>
         <w:t>– Author</w:t>
+      </w:r>
+      <w:r>
+        <w:t xml:space="preserve"> </w:t>
+      </w:r>
+      <w:r>
+        <w:fldChar w:fldCharType="begin"/>
+      </w:r>
+      <w:r>
+        <w:instrText xml:space="preserve"> ADDIN ZOTERO_ITEM CSL_CITATION {"citationID":"LAAaXUC6","properties":{"unsorted":false,"formattedCitation":"(Wyer, n.d.)","plainCitation":"(Wyer, n.d.)","noteIndex":0},"citationItems":[{"id":43,"uris":["http://zotero.org/users/local/ZgM2QhaK/items/Z3DAWWGG"],"itemData":{"id":43,"type":"software","genre":"python","license":"GPL-v3","medium":"Windows, Linux, Unix","title":"Python-Pandas","URL":"https://github.com/BayElectrician/Python-Pandas","version":"0.0.1","author":[{"family":"Wyer","given":"Lachlan"}],"accessed":{"date-parts":[["2026",4,8]]}}}],"schema":"https://github.com/citation-style-language/schema/raw/master/csl-citation.json"} </w:instrText>
+      </w:r>
+      <w:r>
+        <w:fldChar w:fldCharType="separate"/>
+      </w:r>
+      <w:r>
+        <w:rPr>
+          <w:rFonts w:ascii="Aptos" w:hAnsi="Aptos"/>
+        </w:rPr>
+        <w:t>(Wyer, n.d.)</w:t>
+      </w:r>
+      <w:r>
+        <w:fldChar w:fldCharType="end"/>
       </w:r>
     </w:p>
     <w:p>
@@ -681,14 +855,27 @@
       <w:r>
         <w:t xml:space="preserve">Figure </w:t>
       </w:r>
-      <w:fldSimple w:instr=" SEQ Figure \* ARABIC ">
-        <w:r>
-          <w:rPr>
-            <w:noProof/>
-          </w:rPr>
-          <w:t>7</w:t>
-        </w:r>
-      </w:fldSimple>
+      <w:r>
+        <w:fldChar w:fldCharType="begin"/>
+      </w:r>
+      <w:r>
+        <w:instrText xml:space="preserve"> SEQ Figure \* ARABIC </w:instrText>
+      </w:r>
+      <w:r>
+        <w:fldChar w:fldCharType="separate"/>
+      </w:r>
+      <w:r>
+        <w:rPr>
+          <w:noProof/>
+        </w:rPr>
+        <w:t>7</w:t>
+      </w:r>
+      <w:r>
+        <w:rPr>
+          <w:noProof/>
+        </w:rPr>
+        <w:fldChar w:fldCharType="end"/>
+      </w:r>
       <w:r>
         <w:t xml:space="preserve"> - TUI for showing the values</w:t>
       </w:r>
@@ -768,14 +955,27 @@
       <w:r>
         <w:t xml:space="preserve">Figure </w:t>
       </w:r>
-      <w:fldSimple w:instr=" SEQ Figure \* ARABIC ">
-        <w:r>
-          <w:rPr>
-            <w:noProof/>
-          </w:rPr>
-          <w:t>8</w:t>
-        </w:r>
-      </w:fldSimple>
+      <w:r>
+        <w:fldChar w:fldCharType="begin"/>
+      </w:r>
+      <w:r>
+        <w:instrText xml:space="preserve"> SEQ Figure \* ARABIC </w:instrText>
+      </w:r>
+      <w:r>
+        <w:fldChar w:fldCharType="separate"/>
+      </w:r>
+      <w:r>
+        <w:rPr>
+          <w:noProof/>
+        </w:rPr>
+        <w:t>8</w:t>
+      </w:r>
+      <w:r>
+        <w:rPr>
+          <w:noProof/>
+        </w:rPr>
+        <w:fldChar w:fldCharType="end"/>
+      </w:r>
       <w:r>
         <w:t xml:space="preserve"> - Code for displaying final 3 rows</w:t>
       </w:r>
@@ -785,7 +985,34 @@
         <w:pStyle w:val="Caption"/>
       </w:pPr>
       <w:r>
-        <w:t>Source - Author</w:t>
+        <w:t xml:space="preserve">Source </w:t>
+      </w:r>
+      <w:r>
+        <w:t>–</w:t>
+      </w:r>
+      <w:r>
+        <w:t xml:space="preserve"> Author</w:t>
+      </w:r>
+      <w:r>
+        <w:t xml:space="preserve"> </w:t>
+      </w:r>
+      <w:r>
+        <w:fldChar w:fldCharType="begin"/>
+      </w:r>
+      <w:r>
+        <w:instrText xml:space="preserve"> ADDIN ZOTERO_ITEM CSL_CITATION {"citationID":"GxM2hnyu","properties":{"unsorted":false,"formattedCitation":"(Wyer, n.d.)","plainCitation":"(Wyer, n.d.)","noteIndex":0},"citationItems":[{"id":43,"uris":["http://zotero.org/users/local/ZgM2QhaK/items/Z3DAWWGG"],"itemData":{"id":43,"type":"software","genre":"python","license":"GPL-v3","medium":"Windows, Linux, Unix","title":"Python-Pandas","URL":"https://github.com/BayElectrician/Python-Pandas","version":"0.0.1","author":[{"family":"Wyer","given":"Lachlan"}],"accessed":{"date-parts":[["2026",4,8]]}}}],"schema":"https://github.com/citation-style-language/schema/raw/master/csl-citation.json"} </w:instrText>
+      </w:r>
+      <w:r>
+        <w:fldChar w:fldCharType="separate"/>
+      </w:r>
+      <w:r>
+        <w:rPr>
+          <w:rFonts w:ascii="Aptos" w:hAnsi="Aptos"/>
+        </w:rPr>
+        <w:t>(Wyer, n.d.)</w:t>
+      </w:r>
+      <w:r>
+        <w:fldChar w:fldCharType="end"/>
       </w:r>
     </w:p>
     <w:p>
@@ -841,14 +1068,27 @@
       <w:r>
         <w:t xml:space="preserve">Figure </w:t>
       </w:r>
-      <w:fldSimple w:instr=" SEQ Figure \* ARABIC ">
-        <w:r>
-          <w:rPr>
-            <w:noProof/>
-          </w:rPr>
-          <w:t>9</w:t>
-        </w:r>
-      </w:fldSimple>
+      <w:r>
+        <w:fldChar w:fldCharType="begin"/>
+      </w:r>
+      <w:r>
+        <w:instrText xml:space="preserve"> SEQ Figure \* ARABIC </w:instrText>
+      </w:r>
+      <w:r>
+        <w:fldChar w:fldCharType="separate"/>
+      </w:r>
+      <w:r>
+        <w:rPr>
+          <w:noProof/>
+        </w:rPr>
+        <w:t>9</w:t>
+      </w:r>
+      <w:r>
+        <w:rPr>
+          <w:noProof/>
+        </w:rPr>
+        <w:fldChar w:fldCharType="end"/>
+      </w:r>
       <w:r>
         <w:t xml:space="preserve"> - User display of final 3 rows</w:t>
       </w:r>
@@ -892,10 +1132,13 @@
         <w:t xml:space="preserve"> within the dataset (Fig A)</w:t>
       </w:r>
       <w:r>
-        <w:t>. Else with the non-critical values th</w:t>
-      </w:r>
-      <w:r>
-        <w:t xml:space="preserve">ey where just changed to </w:t>
+        <w:t xml:space="preserve">. Else with the non-critical values </w:t>
+      </w:r>
+      <w:r>
+        <w:t>they were</w:t>
+      </w:r>
+      <w:r>
+        <w:t xml:space="preserve"> just changed to </w:t>
       </w:r>
       <w:r>
         <w:t xml:space="preserve">0. </w:t>
@@ -961,6 +1204,9 @@
         <w:jc w:val="center"/>
       </w:pPr>
       <w:r>
+        <w:rPr>
+          <w:noProof/>
+        </w:rPr>
         <w:drawing>
           <wp:inline distT="0" distB="0" distL="0" distR="0" wp14:anchorId="56778C70" wp14:editId="20465825">
             <wp:extent cx="3940629" cy="714692"/>
@@ -1005,14 +1251,27 @@
       <w:r>
         <w:t xml:space="preserve">Figure </w:t>
       </w:r>
-      <w:fldSimple w:instr=" SEQ Figure \* ARABIC ">
-        <w:r>
-          <w:rPr>
-            <w:noProof/>
-          </w:rPr>
-          <w:t>10</w:t>
-        </w:r>
-      </w:fldSimple>
+      <w:r>
+        <w:fldChar w:fldCharType="begin"/>
+      </w:r>
+      <w:r>
+        <w:instrText xml:space="preserve"> SEQ Figure \* ARABIC </w:instrText>
+      </w:r>
+      <w:r>
+        <w:fldChar w:fldCharType="separate"/>
+      </w:r>
+      <w:r>
+        <w:rPr>
+          <w:noProof/>
+        </w:rPr>
+        <w:t>10</w:t>
+      </w:r>
+      <w:r>
+        <w:rPr>
+          <w:noProof/>
+        </w:rPr>
+        <w:fldChar w:fldCharType="end"/>
+      </w:r>
       <w:r>
         <w:t xml:space="preserve"> - Code to check correct age values</w:t>
       </w:r>
@@ -1022,7 +1281,34 @@
         <w:pStyle w:val="Caption"/>
       </w:pPr>
       <w:r>
-        <w:t>Source - Author</w:t>
+        <w:t xml:space="preserve">Source </w:t>
+      </w:r>
+      <w:r>
+        <w:t>–</w:t>
+      </w:r>
+      <w:r>
+        <w:t xml:space="preserve"> Author</w:t>
+      </w:r>
+      <w:r>
+        <w:t xml:space="preserve"> </w:t>
+      </w:r>
+      <w:r>
+        <w:fldChar w:fldCharType="begin"/>
+      </w:r>
+      <w:r>
+        <w:instrText xml:space="preserve"> ADDIN ZOTERO_ITEM CSL_CITATION {"citationID":"V90In3zv","properties":{"unsorted":false,"formattedCitation":"(Wyer, n.d.)","plainCitation":"(Wyer, n.d.)","noteIndex":0},"citationItems":[{"id":43,"uris":["http://zotero.org/users/local/ZgM2QhaK/items/Z3DAWWGG"],"itemData":{"id":43,"type":"software","genre":"python","license":"GPL-v3","medium":"Windows, Linux, Unix","title":"Python-Pandas","URL":"https://github.com/BayElectrician/Python-Pandas","version":"0.0.1","author":[{"family":"Wyer","given":"Lachlan"}],"accessed":{"date-parts":[["2026",4,8]]}}}],"schema":"https://github.com/citation-style-language/schema/raw/master/csl-citation.json"} </w:instrText>
+      </w:r>
+      <w:r>
+        <w:fldChar w:fldCharType="separate"/>
+      </w:r>
+      <w:r>
+        <w:rPr>
+          <w:rFonts w:ascii="Aptos" w:hAnsi="Aptos"/>
+        </w:rPr>
+        <w:t>(Wyer, n.d.)</w:t>
+      </w:r>
+      <w:r>
+        <w:fldChar w:fldCharType="end"/>
       </w:r>
     </w:p>
     <w:p>
@@ -1036,10 +1322,7 @@
     </w:p>
     <w:p>
       <w:r>
-        <w:t xml:space="preserve">Gender, since there is only 1 row of data that does not have gender placed in, it was decided to remove this record from the dataset. </w:t>
-      </w:r>
-      <w:r>
-        <w:t>If over half the data was missing in the column it would be easier to just redo the dataset. Since the</w:t>
+        <w:t>Gender, since there is only 1 row of data that does not have gender placed in, it was decided to remove this record from the dataset. If over half the data was missing in the column it would be easier to just redo the dataset. Since the</w:t>
       </w:r>
       <w:r>
         <w:t xml:space="preserve"> sample of missing data is small </w:t>
@@ -1054,6 +1337,9 @@
         <w:jc w:val="center"/>
       </w:pPr>
       <w:r>
+        <w:rPr>
+          <w:noProof/>
+        </w:rPr>
         <w:drawing>
           <wp:inline distT="0" distB="0" distL="0" distR="0" wp14:anchorId="4DFC2865" wp14:editId="6A152B54">
             <wp:extent cx="4147639" cy="614380"/>
@@ -1098,14 +1384,27 @@
       <w:r>
         <w:t xml:space="preserve">Figure </w:t>
       </w:r>
-      <w:fldSimple w:instr=" SEQ Figure \* ARABIC ">
-        <w:r>
-          <w:rPr>
-            <w:noProof/>
-          </w:rPr>
-          <w:t>11</w:t>
-        </w:r>
-      </w:fldSimple>
+      <w:r>
+        <w:fldChar w:fldCharType="begin"/>
+      </w:r>
+      <w:r>
+        <w:instrText xml:space="preserve"> SEQ Figure \* ARABIC </w:instrText>
+      </w:r>
+      <w:r>
+        <w:fldChar w:fldCharType="separate"/>
+      </w:r>
+      <w:r>
+        <w:rPr>
+          <w:noProof/>
+        </w:rPr>
+        <w:t>11</w:t>
+      </w:r>
+      <w:r>
+        <w:rPr>
+          <w:noProof/>
+        </w:rPr>
+        <w:fldChar w:fldCharType="end"/>
+      </w:r>
       <w:r>
         <w:t xml:space="preserve"> - Code to delete blank gender values</w:t>
       </w:r>
@@ -1115,7 +1414,34 @@
         <w:pStyle w:val="Caption"/>
       </w:pPr>
       <w:r>
-        <w:t>Source - Author</w:t>
+        <w:t xml:space="preserve">Source </w:t>
+      </w:r>
+      <w:r>
+        <w:t>–</w:t>
+      </w:r>
+      <w:r>
+        <w:t xml:space="preserve"> Author</w:t>
+      </w:r>
+      <w:r>
+        <w:t xml:space="preserve"> </w:t>
+      </w:r>
+      <w:r>
+        <w:fldChar w:fldCharType="begin"/>
+      </w:r>
+      <w:r>
+        <w:instrText xml:space="preserve"> ADDIN ZOTERO_ITEM CSL_CITATION {"citationID":"wDzaw0Ig","properties":{"unsorted":false,"formattedCitation":"(Wyer, n.d.)","plainCitation":"(Wyer, n.d.)","noteIndex":0},"citationItems":[{"id":43,"uris":["http://zotero.org/users/local/ZgM2QhaK/items/Z3DAWWGG"],"itemData":{"id":43,"type":"software","genre":"python","license":"GPL-v3","medium":"Windows, Linux, Unix","title":"Python-Pandas","URL":"https://github.com/BayElectrician/Python-Pandas","version":"0.0.1","author":[{"family":"Wyer","given":"Lachlan"}],"accessed":{"date-parts":[["2026",4,8]]}}}],"schema":"https://github.com/citation-style-language/schema/raw/master/csl-citation.json"} </w:instrText>
+      </w:r>
+      <w:r>
+        <w:fldChar w:fldCharType="separate"/>
+      </w:r>
+      <w:r>
+        <w:rPr>
+          <w:rFonts w:ascii="Aptos" w:hAnsi="Aptos"/>
+        </w:rPr>
+        <w:t>(Wyer, n.d.)</w:t>
+      </w:r>
+      <w:r>
+        <w:fldChar w:fldCharType="end"/>
       </w:r>
     </w:p>
     <w:p>
@@ -1137,6 +1463,9 @@
         <w:jc w:val="center"/>
       </w:pPr>
       <w:r>
+        <w:rPr>
+          <w:noProof/>
+        </w:rPr>
         <w:drawing>
           <wp:inline distT="0" distB="0" distL="0" distR="0" wp14:anchorId="156D9234" wp14:editId="39417247">
             <wp:extent cx="4637496" cy="734210"/>
@@ -1181,14 +1510,27 @@
       <w:r>
         <w:t xml:space="preserve">Figure </w:t>
       </w:r>
-      <w:fldSimple w:instr=" SEQ Figure \* ARABIC ">
-        <w:r>
-          <w:rPr>
-            <w:noProof/>
-          </w:rPr>
-          <w:t>12</w:t>
-        </w:r>
-      </w:fldSimple>
+      <w:r>
+        <w:fldChar w:fldCharType="begin"/>
+      </w:r>
+      <w:r>
+        <w:instrText xml:space="preserve"> SEQ Figure \* ARABIC </w:instrText>
+      </w:r>
+      <w:r>
+        <w:fldChar w:fldCharType="separate"/>
+      </w:r>
+      <w:r>
+        <w:rPr>
+          <w:noProof/>
+        </w:rPr>
+        <w:t>12</w:t>
+      </w:r>
+      <w:r>
+        <w:rPr>
+          <w:noProof/>
+        </w:rPr>
+        <w:fldChar w:fldCharType="end"/>
+      </w:r>
       <w:r>
         <w:t xml:space="preserve"> - Placing all cholesterol between the acceptable values</w:t>
       </w:r>
@@ -1198,7 +1540,34 @@
         <w:pStyle w:val="Caption"/>
       </w:pPr>
       <w:r>
-        <w:t>Source - Author</w:t>
+        <w:t xml:space="preserve">Source </w:t>
+      </w:r>
+      <w:r>
+        <w:t>–</w:t>
+      </w:r>
+      <w:r>
+        <w:t xml:space="preserve"> Author</w:t>
+      </w:r>
+      <w:r>
+        <w:t xml:space="preserve"> </w:t>
+      </w:r>
+      <w:r>
+        <w:fldChar w:fldCharType="begin"/>
+      </w:r>
+      <w:r>
+        <w:instrText xml:space="preserve"> ADDIN ZOTERO_ITEM CSL_CITATION {"citationID":"x1jUJZLk","properties":{"unsorted":false,"formattedCitation":"(Wyer, n.d.)","plainCitation":"(Wyer, n.d.)","noteIndex":0},"citationItems":[{"id":43,"uris":["http://zotero.org/users/local/ZgM2QhaK/items/Z3DAWWGG"],"itemData":{"id":43,"type":"software","genre":"python","license":"GPL-v3","medium":"Windows, Linux, Unix","title":"Python-Pandas","URL":"https://github.com/BayElectrician/Python-Pandas","version":"0.0.1","author":[{"family":"Wyer","given":"Lachlan"}],"accessed":{"date-parts":[["2026",4,8]]}}}],"schema":"https://github.com/citation-style-language/schema/raw/master/csl-citation.json"} </w:instrText>
+      </w:r>
+      <w:r>
+        <w:fldChar w:fldCharType="separate"/>
+      </w:r>
+      <w:r>
+        <w:rPr>
+          <w:rFonts w:ascii="Aptos" w:hAnsi="Aptos"/>
+        </w:rPr>
+        <w:t>(Wyer, n.d.)</w:t>
+      </w:r>
+      <w:r>
+        <w:fldChar w:fldCharType="end"/>
       </w:r>
     </w:p>
     <w:p>
@@ -1226,6 +1595,9 @@
         <w:jc w:val="center"/>
       </w:pPr>
       <w:r>
+        <w:rPr>
+          <w:noProof/>
+        </w:rPr>
         <w:drawing>
           <wp:inline distT="0" distB="0" distL="0" distR="0" wp14:anchorId="4A206B8D" wp14:editId="3BD1ADB1">
             <wp:extent cx="4936853" cy="520705"/>
@@ -1270,14 +1642,27 @@
       <w:r>
         <w:t xml:space="preserve">Figure </w:t>
       </w:r>
-      <w:fldSimple w:instr=" SEQ Figure \* ARABIC ">
-        <w:r>
-          <w:rPr>
-            <w:noProof/>
-          </w:rPr>
-          <w:t>13</w:t>
-        </w:r>
-      </w:fldSimple>
+      <w:r>
+        <w:fldChar w:fldCharType="begin"/>
+      </w:r>
+      <w:r>
+        <w:instrText xml:space="preserve"> SEQ Figure \* ARABIC </w:instrText>
+      </w:r>
+      <w:r>
+        <w:fldChar w:fldCharType="separate"/>
+      </w:r>
+      <w:r>
+        <w:rPr>
+          <w:noProof/>
+        </w:rPr>
+        <w:t>13</w:t>
+      </w:r>
+      <w:r>
+        <w:rPr>
+          <w:noProof/>
+        </w:rPr>
+        <w:fldChar w:fldCharType="end"/>
+      </w:r>
       <w:r>
         <w:t xml:space="preserve"> - Dropping all values that are not risk_status values</w:t>
       </w:r>
@@ -1287,7 +1672,34 @@
         <w:pStyle w:val="Caption"/>
       </w:pPr>
       <w:r>
-        <w:t>Source - Author</w:t>
+        <w:t xml:space="preserve">Source </w:t>
+      </w:r>
+      <w:r>
+        <w:t>–</w:t>
+      </w:r>
+      <w:r>
+        <w:t xml:space="preserve"> Author</w:t>
+      </w:r>
+      <w:r>
+        <w:t xml:space="preserve"> </w:t>
+      </w:r>
+      <w:r>
+        <w:fldChar w:fldCharType="begin"/>
+      </w:r>
+      <w:r>
+        <w:instrText xml:space="preserve"> ADDIN ZOTERO_ITEM CSL_CITATION {"citationID":"L9AJnEoL","properties":{"unsorted":false,"formattedCitation":"(Wyer, n.d.)","plainCitation":"(Wyer, n.d.)","noteIndex":0},"citationItems":[{"id":43,"uris":["http://zotero.org/users/local/ZgM2QhaK/items/Z3DAWWGG"],"itemData":{"id":43,"type":"software","genre":"python","license":"GPL-v3","medium":"Windows, Linux, Unix","title":"Python-Pandas","URL":"https://github.com/BayElectrician/Python-Pandas","version":"0.0.1","author":[{"family":"Wyer","given":"Lachlan"}],"accessed":{"date-parts":[["2026",4,8]]}}}],"schema":"https://github.com/citation-style-language/schema/raw/master/csl-citation.json"} </w:instrText>
+      </w:r>
+      <w:r>
+        <w:fldChar w:fldCharType="separate"/>
+      </w:r>
+      <w:r>
+        <w:rPr>
+          <w:rFonts w:ascii="Aptos" w:hAnsi="Aptos"/>
+        </w:rPr>
+        <w:t>(Wyer, n.d.)</w:t>
+      </w:r>
+      <w:r>
+        <w:fldChar w:fldCharType="end"/>
       </w:r>
     </w:p>
     <w:p>
@@ -1379,6 +1791,9 @@
         <w:jc w:val="center"/>
       </w:pPr>
       <w:r>
+        <w:rPr>
+          <w:noProof/>
+        </w:rPr>
         <w:lastRenderedPageBreak/>
         <w:drawing>
           <wp:inline distT="0" distB="0" distL="0" distR="0" wp14:anchorId="61148FD2" wp14:editId="15947143">
@@ -1424,14 +1839,27 @@
       <w:r>
         <w:t xml:space="preserve">Figure </w:t>
       </w:r>
-      <w:fldSimple w:instr=" SEQ Figure \* ARABIC ">
-        <w:r>
-          <w:rPr>
-            <w:noProof/>
-          </w:rPr>
-          <w:t>14</w:t>
-        </w:r>
-      </w:fldSimple>
+      <w:r>
+        <w:fldChar w:fldCharType="begin"/>
+      </w:r>
+      <w:r>
+        <w:instrText xml:space="preserve"> SEQ Figure \* ARABIC </w:instrText>
+      </w:r>
+      <w:r>
+        <w:fldChar w:fldCharType="separate"/>
+      </w:r>
+      <w:r>
+        <w:rPr>
+          <w:noProof/>
+        </w:rPr>
+        <w:t>14</w:t>
+      </w:r>
+      <w:r>
+        <w:rPr>
+          <w:noProof/>
+        </w:rPr>
+        <w:fldChar w:fldCharType="end"/>
+      </w:r>
       <w:r>
         <w:t xml:space="preserve"> - Absolution of the BMI values</w:t>
       </w:r>
@@ -1441,7 +1869,34 @@
         <w:pStyle w:val="Caption"/>
       </w:pPr>
       <w:r>
-        <w:t>Source - Author</w:t>
+        <w:t xml:space="preserve">Source </w:t>
+      </w:r>
+      <w:r>
+        <w:t>–</w:t>
+      </w:r>
+      <w:r>
+        <w:t xml:space="preserve"> Author</w:t>
+      </w:r>
+      <w:r>
+        <w:t xml:space="preserve"> </w:t>
+      </w:r>
+      <w:r>
+        <w:fldChar w:fldCharType="begin"/>
+      </w:r>
+      <w:r>
+        <w:instrText xml:space="preserve"> ADDIN ZOTERO_ITEM CSL_CITATION {"citationID":"rWilTlGp","properties":{"unsorted":false,"formattedCitation":"(Wyer, n.d.)","plainCitation":"(Wyer, n.d.)","noteIndex":0},"citationItems":[{"id":43,"uris":["http://zotero.org/users/local/ZgM2QhaK/items/Z3DAWWGG"],"itemData":{"id":43,"type":"software","genre":"python","license":"GPL-v3","medium":"Windows, Linux, Unix","title":"Python-Pandas","URL":"https://github.com/BayElectrician/Python-Pandas","version":"0.0.1","author":[{"family":"Wyer","given":"Lachlan"}],"accessed":{"date-parts":[["2026",4,8]]}}}],"schema":"https://github.com/citation-style-language/schema/raw/master/csl-citation.json"} </w:instrText>
+      </w:r>
+      <w:r>
+        <w:fldChar w:fldCharType="separate"/>
+      </w:r>
+      <w:r>
+        <w:rPr>
+          <w:rFonts w:ascii="Aptos" w:hAnsi="Aptos"/>
+        </w:rPr>
+        <w:t>(Wyer, n.d.)</w:t>
+      </w:r>
+      <w:r>
+        <w:fldChar w:fldCharType="end"/>
       </w:r>
     </w:p>
     <w:p>
@@ -1469,6 +1924,9 @@
         <w:jc w:val="center"/>
       </w:pPr>
       <w:r>
+        <w:rPr>
+          <w:noProof/>
+        </w:rPr>
         <w:drawing>
           <wp:inline distT="0" distB="0" distL="0" distR="0" wp14:anchorId="472160D1" wp14:editId="299D5C06">
             <wp:extent cx="5731510" cy="440690"/>
@@ -1513,14 +1971,27 @@
       <w:r>
         <w:t xml:space="preserve">Figure </w:t>
       </w:r>
-      <w:fldSimple w:instr=" SEQ Figure \* ARABIC ">
-        <w:r>
-          <w:rPr>
-            <w:noProof/>
-          </w:rPr>
-          <w:t>15</w:t>
-        </w:r>
-      </w:fldSimple>
+      <w:r>
+        <w:fldChar w:fldCharType="begin"/>
+      </w:r>
+      <w:r>
+        <w:instrText xml:space="preserve"> SEQ Figure \* ARABIC </w:instrText>
+      </w:r>
+      <w:r>
+        <w:fldChar w:fldCharType="separate"/>
+      </w:r>
+      <w:r>
+        <w:rPr>
+          <w:noProof/>
+        </w:rPr>
+        <w:t>15</w:t>
+      </w:r>
+      <w:r>
+        <w:rPr>
+          <w:noProof/>
+        </w:rPr>
+        <w:fldChar w:fldCharType="end"/>
+      </w:r>
       <w:r>
         <w:t xml:space="preserve"> - Absolution of negative exercise values</w:t>
       </w:r>
@@ -1530,7 +2001,34 @@
         <w:pStyle w:val="Caption"/>
       </w:pPr>
       <w:r>
-        <w:t>Source - Author</w:t>
+        <w:t xml:space="preserve">Source </w:t>
+      </w:r>
+      <w:r>
+        <w:t>–</w:t>
+      </w:r>
+      <w:r>
+        <w:t xml:space="preserve"> Author</w:t>
+      </w:r>
+      <w:r>
+        <w:t xml:space="preserve"> </w:t>
+      </w:r>
+      <w:r>
+        <w:fldChar w:fldCharType="begin"/>
+      </w:r>
+      <w:r>
+        <w:instrText xml:space="preserve"> ADDIN ZOTERO_ITEM CSL_CITATION {"citationID":"JcziRsnM","properties":{"unsorted":false,"formattedCitation":"(Wyer, n.d.)","plainCitation":"(Wyer, n.d.)","noteIndex":0},"citationItems":[{"id":43,"uris":["http://zotero.org/users/local/ZgM2QhaK/items/Z3DAWWGG"],"itemData":{"id":43,"type":"software","genre":"python","license":"GPL-v3","medium":"Windows, Linux, Unix","title":"Python-Pandas","URL":"https://github.com/BayElectrician/Python-Pandas","version":"0.0.1","author":[{"family":"Wyer","given":"Lachlan"}],"accessed":{"date-parts":[["2026",4,8]]}}}],"schema":"https://github.com/citation-style-language/schema/raw/master/csl-citation.json"} </w:instrText>
+      </w:r>
+      <w:r>
+        <w:fldChar w:fldCharType="separate"/>
+      </w:r>
+      <w:r>
+        <w:rPr>
+          <w:rFonts w:ascii="Aptos" w:hAnsi="Aptos"/>
+        </w:rPr>
+        <w:t>(Wyer, n.d.)</w:t>
+      </w:r>
+      <w:r>
+        <w:fldChar w:fldCharType="end"/>
       </w:r>
     </w:p>
     <w:p>
@@ -1567,6 +2065,9 @@
         <w:jc w:val="center"/>
       </w:pPr>
       <w:r>
+        <w:rPr>
+          <w:noProof/>
+        </w:rPr>
         <w:drawing>
           <wp:inline distT="0" distB="0" distL="0" distR="0" wp14:anchorId="63E6FFD6" wp14:editId="21D51B16">
             <wp:extent cx="5290457" cy="4262962"/>
@@ -1611,14 +2112,27 @@
       <w:r>
         <w:t xml:space="preserve">Figure </w:t>
       </w:r>
-      <w:fldSimple w:instr=" SEQ Figure \* ARABIC ">
-        <w:r>
-          <w:rPr>
-            <w:noProof/>
-          </w:rPr>
-          <w:t>16</w:t>
-        </w:r>
-      </w:fldSimple>
+      <w:r>
+        <w:fldChar w:fldCharType="begin"/>
+      </w:r>
+      <w:r>
+        <w:instrText xml:space="preserve"> SEQ Figure \* ARABIC </w:instrText>
+      </w:r>
+      <w:r>
+        <w:fldChar w:fldCharType="separate"/>
+      </w:r>
+      <w:r>
+        <w:rPr>
+          <w:noProof/>
+        </w:rPr>
+        <w:t>16</w:t>
+      </w:r>
+      <w:r>
+        <w:rPr>
+          <w:noProof/>
+        </w:rPr>
+        <w:fldChar w:fldCharType="end"/>
+      </w:r>
       <w:r>
         <w:t xml:space="preserve"> - Entire codebase for the data clean</w:t>
       </w:r>
@@ -1628,7 +2142,34 @@
         <w:pStyle w:val="Caption"/>
       </w:pPr>
       <w:r>
-        <w:t>Source - Author</w:t>
+        <w:t xml:space="preserve">Source </w:t>
+      </w:r>
+      <w:r>
+        <w:t>–</w:t>
+      </w:r>
+      <w:r>
+        <w:t xml:space="preserve"> Author</w:t>
+      </w:r>
+      <w:r>
+        <w:t xml:space="preserve"> </w:t>
+      </w:r>
+      <w:r>
+        <w:fldChar w:fldCharType="begin"/>
+      </w:r>
+      <w:r>
+        <w:instrText xml:space="preserve"> ADDIN ZOTERO_ITEM CSL_CITATION {"citationID":"qlxpD2I0","properties":{"unsorted":false,"formattedCitation":"(Wyer, n.d.)","plainCitation":"(Wyer, n.d.)","noteIndex":0},"citationItems":[{"id":43,"uris":["http://zotero.org/users/local/ZgM2QhaK/items/Z3DAWWGG"],"itemData":{"id":43,"type":"software","genre":"python","license":"GPL-v3","medium":"Windows, Linux, Unix","title":"Python-Pandas","URL":"https://github.com/BayElectrician/Python-Pandas","version":"0.0.1","author":[{"family":"Wyer","given":"Lachlan"}],"accessed":{"date-parts":[["2026",4,8]]}}}],"schema":"https://github.com/citation-style-language/schema/raw/master/csl-citation.json"} </w:instrText>
+      </w:r>
+      <w:r>
+        <w:fldChar w:fldCharType="separate"/>
+      </w:r>
+      <w:r>
+        <w:rPr>
+          <w:rFonts w:ascii="Aptos" w:hAnsi="Aptos"/>
+        </w:rPr>
+        <w:t>(Wyer, n.d.)</w:t>
+      </w:r>
+      <w:r>
+        <w:fldChar w:fldCharType="end"/>
       </w:r>
     </w:p>
     <w:p>
@@ -1636,6 +2177,9 @@
         <w:keepNext/>
       </w:pPr>
       <w:r>
+        <w:rPr>
+          <w:noProof/>
+        </w:rPr>
         <w:lastRenderedPageBreak/>
         <w:drawing>
           <wp:inline distT="0" distB="0" distL="0" distR="0" wp14:anchorId="73AA1E55" wp14:editId="394BFC66">
@@ -1681,14 +2225,27 @@
       <w:r>
         <w:t xml:space="preserve">Figure </w:t>
       </w:r>
-      <w:fldSimple w:instr=" SEQ Figure \* ARABIC ">
-        <w:r>
-          <w:rPr>
-            <w:noProof/>
-          </w:rPr>
-          <w:t>17</w:t>
-        </w:r>
-      </w:fldSimple>
+      <w:r>
+        <w:fldChar w:fldCharType="begin"/>
+      </w:r>
+      <w:r>
+        <w:instrText xml:space="preserve"> SEQ Figure \* ARABIC </w:instrText>
+      </w:r>
+      <w:r>
+        <w:fldChar w:fldCharType="separate"/>
+      </w:r>
+      <w:r>
+        <w:rPr>
+          <w:noProof/>
+        </w:rPr>
+        <w:t>17</w:t>
+      </w:r>
+      <w:r>
+        <w:rPr>
+          <w:noProof/>
+        </w:rPr>
+        <w:fldChar w:fldCharType="end"/>
+      </w:r>
       <w:r>
         <w:t xml:space="preserve"> - TUI for clean data function</w:t>
       </w:r>
@@ -1698,7 +2255,13 @@
         <w:pStyle w:val="Caption"/>
       </w:pPr>
       <w:r>
-        <w:t>Source - Author</w:t>
+        <w:t xml:space="preserve">Source </w:t>
+      </w:r>
+      <w:r>
+        <w:t>–</w:t>
+      </w:r>
+      <w:r>
+        <w:t xml:space="preserve"> Author</w:t>
       </w:r>
     </w:p>
     <w:p>
@@ -1720,7 +2283,13 @@
         <w:t xml:space="preserve">If a user does this before </w:t>
       </w:r>
       <w:r>
-        <w:t xml:space="preserve">cleaning the data (Fig 11 Currently) </w:t>
+        <w:t>cleaning the data (Fig 1</w:t>
+      </w:r>
+      <w:r>
+        <w:t>8</w:t>
+      </w:r>
+      <w:r>
+        <w:t xml:space="preserve">) </w:t>
       </w:r>
       <w:r>
         <w:t xml:space="preserve">they will find a summary that contains some answer that are clearly wrong. I.E the maximum age being 200, </w:t>
@@ -1735,7 +2304,13 @@
         <w:t xml:space="preserve"> and exercise of -1.0</w:t>
       </w:r>
       <w:r>
-        <w:t xml:space="preserve"> (Fig 12 Currently). </w:t>
+        <w:t xml:space="preserve"> (Fig </w:t>
+      </w:r>
+      <w:r>
+        <w:t>19</w:t>
+      </w:r>
+      <w:r>
+        <w:t xml:space="preserve">). </w:t>
       </w:r>
       <w:r>
         <w:t>However,</w:t>
@@ -1795,7 +2370,10 @@
         <w:t xml:space="preserve">Determining the </w:t>
       </w:r>
       <w:r>
-        <w:t xml:space="preserve">weakest, strongest and average of the human health within the clinic Data provided </w:t>
+        <w:t>weakest, strongest and average of the human health within the clinic Data provided</w:t>
+      </w:r>
+      <w:r>
+        <w:t>.</w:t>
       </w:r>
     </w:p>
     <w:p>
@@ -1891,14 +2469,27 @@
       <w:r>
         <w:t xml:space="preserve">Figure </w:t>
       </w:r>
-      <w:fldSimple w:instr=" SEQ Figure \* ARABIC ">
-        <w:r>
-          <w:rPr>
-            <w:noProof/>
-          </w:rPr>
-          <w:t>18</w:t>
-        </w:r>
-      </w:fldSimple>
+      <w:r>
+        <w:fldChar w:fldCharType="begin"/>
+      </w:r>
+      <w:r>
+        <w:instrText xml:space="preserve"> SEQ Figure \* ARABIC </w:instrText>
+      </w:r>
+      <w:r>
+        <w:fldChar w:fldCharType="separate"/>
+      </w:r>
+      <w:r>
+        <w:rPr>
+          <w:noProof/>
+        </w:rPr>
+        <w:t>18</w:t>
+      </w:r>
+      <w:r>
+        <w:rPr>
+          <w:noProof/>
+        </w:rPr>
+        <w:fldChar w:fldCharType="end"/>
+      </w:r>
       <w:r>
         <w:t xml:space="preserve"> - Code for calculating a 4 number summary for each numerical column</w:t>
       </w:r>
@@ -1909,6 +2500,27 @@
       </w:pPr>
       <w:r>
         <w:t>Source – Author</w:t>
+      </w:r>
+      <w:r>
+        <w:t xml:space="preserve"> </w:t>
+      </w:r>
+      <w:r>
+        <w:fldChar w:fldCharType="begin"/>
+      </w:r>
+      <w:r>
+        <w:instrText xml:space="preserve"> ADDIN ZOTERO_ITEM CSL_CITATION {"citationID":"kZigfPmj","properties":{"unsorted":false,"formattedCitation":"(Wyer, n.d.)","plainCitation":"(Wyer, n.d.)","noteIndex":0},"citationItems":[{"id":43,"uris":["http://zotero.org/users/local/ZgM2QhaK/items/Z3DAWWGG"],"itemData":{"id":43,"type":"software","genre":"python","license":"GPL-v3","medium":"Windows, Linux, Unix","title":"Python-Pandas","URL":"https://github.com/BayElectrician/Python-Pandas","version":"0.0.1","author":[{"family":"Wyer","given":"Lachlan"}],"accessed":{"date-parts":[["2026",4,8]]}}}],"schema":"https://github.com/citation-style-language/schema/raw/master/csl-citation.json"} </w:instrText>
+      </w:r>
+      <w:r>
+        <w:fldChar w:fldCharType="separate"/>
+      </w:r>
+      <w:r>
+        <w:rPr>
+          <w:rFonts w:ascii="Aptos" w:hAnsi="Aptos"/>
+        </w:rPr>
+        <w:t>(Wyer, n.d.)</w:t>
+      </w:r>
+      <w:r>
+        <w:fldChar w:fldCharType="end"/>
       </w:r>
     </w:p>
     <w:p>
@@ -1964,14 +2576,27 @@
       <w:r>
         <w:t xml:space="preserve">Figure </w:t>
       </w:r>
-      <w:fldSimple w:instr=" SEQ Figure \* ARABIC ">
-        <w:r>
-          <w:rPr>
-            <w:noProof/>
-          </w:rPr>
-          <w:t>19</w:t>
-        </w:r>
-      </w:fldSimple>
+      <w:r>
+        <w:fldChar w:fldCharType="begin"/>
+      </w:r>
+      <w:r>
+        <w:instrText xml:space="preserve"> SEQ Figure \* ARABIC </w:instrText>
+      </w:r>
+      <w:r>
+        <w:fldChar w:fldCharType="separate"/>
+      </w:r>
+      <w:r>
+        <w:rPr>
+          <w:noProof/>
+        </w:rPr>
+        <w:t>19</w:t>
+      </w:r>
+      <w:r>
+        <w:rPr>
+          <w:noProof/>
+        </w:rPr>
+        <w:fldChar w:fldCharType="end"/>
+      </w:r>
       <w:r>
         <w:t xml:space="preserve"> - Summary before clean</w:t>
       </w:r>
@@ -2092,14 +2717,27 @@
       <w:r>
         <w:t xml:space="preserve">Figure </w:t>
       </w:r>
-      <w:fldSimple w:instr=" SEQ Figure \* ARABIC ">
-        <w:r>
-          <w:rPr>
-            <w:noProof/>
-          </w:rPr>
-          <w:t>20</w:t>
-        </w:r>
-      </w:fldSimple>
+      <w:r>
+        <w:fldChar w:fldCharType="begin"/>
+      </w:r>
+      <w:r>
+        <w:instrText xml:space="preserve"> SEQ Figure \* ARABIC </w:instrText>
+      </w:r>
+      <w:r>
+        <w:fldChar w:fldCharType="separate"/>
+      </w:r>
+      <w:r>
+        <w:rPr>
+          <w:noProof/>
+        </w:rPr>
+        <w:t>20</w:t>
+      </w:r>
+      <w:r>
+        <w:rPr>
+          <w:noProof/>
+        </w:rPr>
+        <w:fldChar w:fldCharType="end"/>
+      </w:r>
       <w:r>
         <w:t xml:space="preserve"> - Code to great the cholesterol histogram</w:t>
       </w:r>
@@ -2109,7 +2747,34 @@
         <w:pStyle w:val="Caption"/>
       </w:pPr>
       <w:r>
-        <w:t>Source - Author</w:t>
+        <w:t xml:space="preserve">Source </w:t>
+      </w:r>
+      <w:r>
+        <w:t>–</w:t>
+      </w:r>
+      <w:r>
+        <w:t xml:space="preserve"> Author</w:t>
+      </w:r>
+      <w:r>
+        <w:t xml:space="preserve"> </w:t>
+      </w:r>
+      <w:r>
+        <w:fldChar w:fldCharType="begin"/>
+      </w:r>
+      <w:r>
+        <w:instrText xml:space="preserve"> ADDIN ZOTERO_ITEM CSL_CITATION {"citationID":"zFRTiKwa","properties":{"unsorted":false,"formattedCitation":"(Wyer, n.d.)","plainCitation":"(Wyer, n.d.)","noteIndex":0},"citationItems":[{"id":43,"uris":["http://zotero.org/users/local/ZgM2QhaK/items/Z3DAWWGG"],"itemData":{"id":43,"type":"software","genre":"python","license":"GPL-v3","medium":"Windows, Linux, Unix","title":"Python-Pandas","URL":"https://github.com/BayElectrician/Python-Pandas","version":"0.0.1","author":[{"family":"Wyer","given":"Lachlan"}],"accessed":{"date-parts":[["2026",4,8]]}}}],"schema":"https://github.com/citation-style-language/schema/raw/master/csl-citation.json"} </w:instrText>
+      </w:r>
+      <w:r>
+        <w:fldChar w:fldCharType="separate"/>
+      </w:r>
+      <w:r>
+        <w:rPr>
+          <w:rFonts w:ascii="Aptos" w:hAnsi="Aptos"/>
+        </w:rPr>
+        <w:t>(Wyer, n.d.)</w:t>
+      </w:r>
+      <w:r>
+        <w:fldChar w:fldCharType="end"/>
       </w:r>
     </w:p>
     <w:p>
@@ -2165,14 +2830,27 @@
       <w:r>
         <w:t xml:space="preserve">Figure </w:t>
       </w:r>
-      <w:fldSimple w:instr=" SEQ Figure \* ARABIC ">
-        <w:r>
-          <w:rPr>
-            <w:noProof/>
-          </w:rPr>
-          <w:t>21</w:t>
-        </w:r>
-      </w:fldSimple>
+      <w:r>
+        <w:fldChar w:fldCharType="begin"/>
+      </w:r>
+      <w:r>
+        <w:instrText xml:space="preserve"> SEQ Figure \* ARABIC </w:instrText>
+      </w:r>
+      <w:r>
+        <w:fldChar w:fldCharType="separate"/>
+      </w:r>
+      <w:r>
+        <w:rPr>
+          <w:noProof/>
+        </w:rPr>
+        <w:t>21</w:t>
+      </w:r>
+      <w:r>
+        <w:rPr>
+          <w:noProof/>
+        </w:rPr>
+        <w:fldChar w:fldCharType="end"/>
+      </w:r>
       <w:r>
         <w:t xml:space="preserve"> - TUI for histogram graph</w:t>
       </w:r>
@@ -2191,6 +2869,9 @@
         <w:jc w:val="center"/>
       </w:pPr>
       <w:r>
+        <w:rPr>
+          <w:noProof/>
+        </w:rPr>
         <w:drawing>
           <wp:inline distT="0" distB="0" distL="0" distR="0" wp14:anchorId="276F64F2" wp14:editId="238F0988">
             <wp:extent cx="4058830" cy="3209381"/>
@@ -2235,14 +2916,27 @@
       <w:r>
         <w:t xml:space="preserve">Figure </w:t>
       </w:r>
-      <w:fldSimple w:instr=" SEQ Figure \* ARABIC ">
-        <w:r>
-          <w:rPr>
-            <w:noProof/>
-          </w:rPr>
-          <w:t>22</w:t>
-        </w:r>
-      </w:fldSimple>
+      <w:r>
+        <w:fldChar w:fldCharType="begin"/>
+      </w:r>
+      <w:r>
+        <w:instrText xml:space="preserve"> SEQ Figure \* ARABIC </w:instrText>
+      </w:r>
+      <w:r>
+        <w:fldChar w:fldCharType="separate"/>
+      </w:r>
+      <w:r>
+        <w:rPr>
+          <w:noProof/>
+        </w:rPr>
+        <w:t>22</w:t>
+      </w:r>
+      <w:r>
+        <w:rPr>
+          <w:noProof/>
+        </w:rPr>
+        <w:fldChar w:fldCharType="end"/>
+      </w:r>
       <w:r>
         <w:t xml:space="preserve"> - Example cholesterol histogram</w:t>
       </w:r>
@@ -2372,14 +3066,27 @@
       <w:r>
         <w:t xml:space="preserve">Figure </w:t>
       </w:r>
-      <w:fldSimple w:instr=" SEQ Figure \* ARABIC ">
-        <w:r>
-          <w:rPr>
-            <w:noProof/>
-          </w:rPr>
-          <w:t>23</w:t>
-        </w:r>
-      </w:fldSimple>
+      <w:r>
+        <w:fldChar w:fldCharType="begin"/>
+      </w:r>
+      <w:r>
+        <w:instrText xml:space="preserve"> SEQ Figure \* ARABIC </w:instrText>
+      </w:r>
+      <w:r>
+        <w:fldChar w:fldCharType="separate"/>
+      </w:r>
+      <w:r>
+        <w:rPr>
+          <w:noProof/>
+        </w:rPr>
+        <w:t>23</w:t>
+      </w:r>
+      <w:r>
+        <w:rPr>
+          <w:noProof/>
+        </w:rPr>
+        <w:fldChar w:fldCharType="end"/>
+      </w:r>
       <w:r>
         <w:t xml:space="preserve"> - Code to create the age groupings chart</w:t>
       </w:r>
@@ -2389,7 +3096,34 @@
         <w:pStyle w:val="Caption"/>
       </w:pPr>
       <w:r>
-        <w:t>Source - Author</w:t>
+        <w:t xml:space="preserve">Source </w:t>
+      </w:r>
+      <w:r>
+        <w:t>–</w:t>
+      </w:r>
+      <w:r>
+        <w:t xml:space="preserve"> Author</w:t>
+      </w:r>
+      <w:r>
+        <w:t xml:space="preserve"> </w:t>
+      </w:r>
+      <w:r>
+        <w:fldChar w:fldCharType="begin"/>
+      </w:r>
+      <w:r>
+        <w:instrText xml:space="preserve"> ADDIN ZOTERO_ITEM CSL_CITATION {"citationID":"4RI2cK3y","properties":{"unsorted":false,"formattedCitation":"(Wyer, n.d.)","plainCitation":"(Wyer, n.d.)","noteIndex":0},"citationItems":[{"id":43,"uris":["http://zotero.org/users/local/ZgM2QhaK/items/Z3DAWWGG"],"itemData":{"id":43,"type":"software","genre":"python","license":"GPL-v3","medium":"Windows, Linux, Unix","title":"Python-Pandas","URL":"https://github.com/BayElectrician/Python-Pandas","version":"0.0.1","author":[{"family":"Wyer","given":"Lachlan"}],"accessed":{"date-parts":[["2026",4,8]]}}}],"schema":"https://github.com/citation-style-language/schema/raw/master/csl-citation.json"} </w:instrText>
+      </w:r>
+      <w:r>
+        <w:fldChar w:fldCharType="separate"/>
+      </w:r>
+      <w:r>
+        <w:rPr>
+          <w:rFonts w:ascii="Aptos" w:hAnsi="Aptos"/>
+        </w:rPr>
+        <w:t>(Wyer, n.d.)</w:t>
+      </w:r>
+      <w:r>
+        <w:fldChar w:fldCharType="end"/>
       </w:r>
     </w:p>
     <w:p>
@@ -2444,14 +3178,27 @@
       <w:r>
         <w:t xml:space="preserve">Figure </w:t>
       </w:r>
-      <w:fldSimple w:instr=" SEQ Figure \* ARABIC ">
-        <w:r>
-          <w:rPr>
-            <w:noProof/>
-          </w:rPr>
-          <w:t>24</w:t>
-        </w:r>
-      </w:fldSimple>
+      <w:r>
+        <w:fldChar w:fldCharType="begin"/>
+      </w:r>
+      <w:r>
+        <w:instrText xml:space="preserve"> SEQ Figure \* ARABIC </w:instrText>
+      </w:r>
+      <w:r>
+        <w:fldChar w:fldCharType="separate"/>
+      </w:r>
+      <w:r>
+        <w:rPr>
+          <w:noProof/>
+        </w:rPr>
+        <w:t>24</w:t>
+      </w:r>
+      <w:r>
+        <w:rPr>
+          <w:noProof/>
+        </w:rPr>
+        <w:fldChar w:fldCharType="end"/>
+      </w:r>
       <w:r>
         <w:t xml:space="preserve"> - TUI explaining the chart is open in a new window</w:t>
       </w:r>
@@ -2461,7 +3208,16 @@
         <w:pStyle w:val="Caption"/>
       </w:pPr>
       <w:r>
-        <w:t>Source - Author</w:t>
+        <w:t xml:space="preserve">Source </w:t>
+      </w:r>
+      <w:r>
+        <w:t>–</w:t>
+      </w:r>
+      <w:r>
+        <w:t xml:space="preserve"> Author</w:t>
+      </w:r>
+      <w:r>
+        <w:t xml:space="preserve"> </w:t>
       </w:r>
     </w:p>
     <w:p/>
@@ -2519,14 +3275,27 @@
       <w:r>
         <w:t xml:space="preserve">Figure </w:t>
       </w:r>
-      <w:fldSimple w:instr=" SEQ Figure \* ARABIC ">
-        <w:r>
-          <w:rPr>
-            <w:noProof/>
-          </w:rPr>
-          <w:t>25</w:t>
-        </w:r>
-      </w:fldSimple>
+      <w:r>
+        <w:fldChar w:fldCharType="begin"/>
+      </w:r>
+      <w:r>
+        <w:instrText xml:space="preserve"> SEQ Figure \* ARABIC </w:instrText>
+      </w:r>
+      <w:r>
+        <w:fldChar w:fldCharType="separate"/>
+      </w:r>
+      <w:r>
+        <w:rPr>
+          <w:noProof/>
+        </w:rPr>
+        <w:t>25</w:t>
+      </w:r>
+      <w:r>
+        <w:rPr>
+          <w:noProof/>
+        </w:rPr>
+        <w:fldChar w:fldCharType="end"/>
+      </w:r>
       <w:r>
         <w:t xml:space="preserve"> - Age group bar chart before data clean</w:t>
       </w:r>
@@ -2538,6 +3307,9 @@
       </w:pPr>
       <w:r>
         <w:t>Source – Author</w:t>
+      </w:r>
+      <w:r>
+        <w:t xml:space="preserve"> </w:t>
       </w:r>
     </w:p>
     <w:p>
@@ -2550,6 +3322,9 @@
         <w:br/>
       </w:r>
       <w:r>
+        <w:rPr>
+          <w:noProof/>
+        </w:rPr>
         <w:drawing>
           <wp:inline distT="0" distB="0" distL="0" distR="0" wp14:anchorId="294F9ADC" wp14:editId="55A5B783">
             <wp:extent cx="3528464" cy="2763429"/>
@@ -2594,14 +3369,27 @@
       <w:r>
         <w:t xml:space="preserve">Figure </w:t>
       </w:r>
-      <w:fldSimple w:instr=" SEQ Figure \* ARABIC ">
-        <w:r>
-          <w:rPr>
-            <w:noProof/>
-          </w:rPr>
-          <w:t>26</w:t>
-        </w:r>
-      </w:fldSimple>
+      <w:r>
+        <w:fldChar w:fldCharType="begin"/>
+      </w:r>
+      <w:r>
+        <w:instrText xml:space="preserve"> SEQ Figure \* ARABIC </w:instrText>
+      </w:r>
+      <w:r>
+        <w:fldChar w:fldCharType="separate"/>
+      </w:r>
+      <w:r>
+        <w:rPr>
+          <w:noProof/>
+        </w:rPr>
+        <w:t>26</w:t>
+      </w:r>
+      <w:r>
+        <w:rPr>
+          <w:noProof/>
+        </w:rPr>
+        <w:fldChar w:fldCharType="end"/>
+      </w:r>
       <w:r>
         <w:t xml:space="preserve"> - Age group bar chart after data clean</w:t>
       </w:r>
@@ -2611,7 +3399,16 @@
         <w:pStyle w:val="Caption"/>
       </w:pPr>
       <w:r>
-        <w:t>Source - Author</w:t>
+        <w:t xml:space="preserve">Source </w:t>
+      </w:r>
+      <w:r>
+        <w:t>–</w:t>
+      </w:r>
+      <w:r>
+        <w:t xml:space="preserve"> Author</w:t>
+      </w:r>
+      <w:r>
+        <w:t xml:space="preserve"> </w:t>
       </w:r>
     </w:p>
     <w:p>
@@ -2656,6 +3453,7 @@
     </w:p>
     <w:p>
       <w:commentRangeStart w:id="0"/>
+      <w:commentRangeStart w:id="1"/>
       <w:r>
         <w:t>Analysis from the data will be conducted on the clean dataset</w:t>
       </w:r>
@@ -2689,12 +3487,24 @@
         </w:rPr>
         <w:commentReference w:id="0"/>
       </w:r>
+      <w:commentRangeEnd w:id="1"/>
+      <w:r>
+        <w:rPr>
+          <w:rStyle w:val="CommentReference"/>
+          <w:sz w:val="24"/>
+          <w:szCs w:val="24"/>
+        </w:rPr>
+        <w:commentReference w:id="1"/>
+      </w:r>
     </w:p>
     <w:p>
       <w:pPr>
         <w:keepNext/>
       </w:pPr>
       <w:r>
+        <w:rPr>
+          <w:noProof/>
+        </w:rPr>
         <w:lastRenderedPageBreak/>
         <w:drawing>
           <wp:inline distT="0" distB="0" distL="0" distR="0" wp14:anchorId="70167538" wp14:editId="590B277C">
@@ -2733,6 +3543,9 @@
         </w:drawing>
       </w:r>
       <w:r>
+        <w:rPr>
+          <w:noProof/>
+        </w:rPr>
         <w:drawing>
           <wp:inline distT="0" distB="0" distL="0" distR="0" wp14:anchorId="60108683" wp14:editId="71877F9A">
             <wp:extent cx="3712029" cy="1882335"/>
@@ -2777,14 +3590,27 @@
       <w:r>
         <w:t xml:space="preserve">Figure </w:t>
       </w:r>
-      <w:fldSimple w:instr=" SEQ Figure \* ARABIC ">
-        <w:r>
-          <w:rPr>
-            <w:noProof/>
-          </w:rPr>
-          <w:t>27</w:t>
-        </w:r>
-      </w:fldSimple>
+      <w:r>
+        <w:fldChar w:fldCharType="begin"/>
+      </w:r>
+      <w:r>
+        <w:instrText xml:space="preserve"> SEQ Figure \* ARABIC </w:instrText>
+      </w:r>
+      <w:r>
+        <w:fldChar w:fldCharType="separate"/>
+      </w:r>
+      <w:r>
+        <w:rPr>
+          <w:noProof/>
+        </w:rPr>
+        <w:t>27</w:t>
+      </w:r>
+      <w:r>
+        <w:rPr>
+          <w:noProof/>
+        </w:rPr>
+        <w:fldChar w:fldCharType="end"/>
+      </w:r>
       <w:r>
         <w:t xml:space="preserve"> - Code to create the comparison chart of risk status</w:t>
       </w:r>
@@ -2801,6 +3627,27 @@
       </w:r>
       <w:r>
         <w:t xml:space="preserve"> Author</w:t>
+      </w:r>
+      <w:r>
+        <w:t xml:space="preserve"> </w:t>
+      </w:r>
+      <w:r>
+        <w:fldChar w:fldCharType="begin"/>
+      </w:r>
+      <w:r>
+        <w:instrText xml:space="preserve"> ADDIN ZOTERO_ITEM CSL_CITATION {"citationID":"WyDFZ8mS","properties":{"unsorted":false,"formattedCitation":"(Wyer, n.d.)","plainCitation":"(Wyer, n.d.)","noteIndex":0},"citationItems":[{"id":43,"uris":["http://zotero.org/users/local/ZgM2QhaK/items/Z3DAWWGG"],"itemData":{"id":43,"type":"software","genre":"python","license":"GPL-v3","medium":"Windows, Linux, Unix","title":"Python-Pandas","URL":"https://github.com/BayElectrician/Python-Pandas","version":"0.0.1","author":[{"family":"Wyer","given":"Lachlan"}],"accessed":{"date-parts":[["2026",4,8]]}}}],"schema":"https://github.com/citation-style-language/schema/raw/master/csl-citation.json"} </w:instrText>
+      </w:r>
+      <w:r>
+        <w:fldChar w:fldCharType="separate"/>
+      </w:r>
+      <w:r>
+        <w:rPr>
+          <w:rFonts w:ascii="Aptos" w:hAnsi="Aptos"/>
+        </w:rPr>
+        <w:t>(Wyer, n.d.)</w:t>
+      </w:r>
+      <w:r>
+        <w:fldChar w:fldCharType="end"/>
       </w:r>
     </w:p>
     <w:p>
@@ -2809,6 +3656,9 @@
         <w:jc w:val="center"/>
       </w:pPr>
       <w:r>
+        <w:rPr>
+          <w:noProof/>
+        </w:rPr>
         <w:lastRenderedPageBreak/>
         <w:drawing>
           <wp:inline distT="0" distB="0" distL="0" distR="0" wp14:anchorId="2D924436" wp14:editId="339D40A3">
@@ -2854,14 +3704,27 @@
       <w:r>
         <w:t xml:space="preserve">Figure </w:t>
       </w:r>
-      <w:fldSimple w:instr=" SEQ Figure \* ARABIC ">
-        <w:r>
-          <w:rPr>
-            <w:noProof/>
-          </w:rPr>
-          <w:t>28</w:t>
-        </w:r>
-      </w:fldSimple>
+      <w:r>
+        <w:fldChar w:fldCharType="begin"/>
+      </w:r>
+      <w:r>
+        <w:instrText xml:space="preserve"> SEQ Figure \* ARABIC </w:instrText>
+      </w:r>
+      <w:r>
+        <w:fldChar w:fldCharType="separate"/>
+      </w:r>
+      <w:r>
+        <w:rPr>
+          <w:noProof/>
+        </w:rPr>
+        <w:t>28</w:t>
+      </w:r>
+      <w:r>
+        <w:rPr>
+          <w:noProof/>
+        </w:rPr>
+        <w:fldChar w:fldCharType="end"/>
+      </w:r>
       <w:r>
         <w:t xml:space="preserve"> - Risk status and Gender correlation before data clean</w:t>
       </w:r>
@@ -2871,7 +3734,16 @@
         <w:pStyle w:val="Caption"/>
       </w:pPr>
       <w:r>
-        <w:t>Source - Author</w:t>
+        <w:t xml:space="preserve">Source </w:t>
+      </w:r>
+      <w:r>
+        <w:t>–</w:t>
+      </w:r>
+      <w:r>
+        <w:t xml:space="preserve"> Author</w:t>
+      </w:r>
+      <w:r>
+        <w:t xml:space="preserve"> </w:t>
       </w:r>
     </w:p>
     <w:p>
@@ -2880,6 +3752,9 @@
         <w:jc w:val="center"/>
       </w:pPr>
       <w:r>
+        <w:rPr>
+          <w:noProof/>
+        </w:rPr>
         <w:drawing>
           <wp:inline distT="0" distB="0" distL="0" distR="0" wp14:anchorId="0AAD340B" wp14:editId="687FD1EC">
             <wp:extent cx="2946886" cy="2312859"/>
@@ -2924,14 +3799,27 @@
       <w:r>
         <w:t xml:space="preserve">Figure </w:t>
       </w:r>
-      <w:fldSimple w:instr=" SEQ Figure \* ARABIC ">
-        <w:r>
-          <w:rPr>
-            <w:noProof/>
-          </w:rPr>
-          <w:t>29</w:t>
-        </w:r>
-      </w:fldSimple>
+      <w:r>
+        <w:fldChar w:fldCharType="begin"/>
+      </w:r>
+      <w:r>
+        <w:instrText xml:space="preserve"> SEQ Figure \* ARABIC </w:instrText>
+      </w:r>
+      <w:r>
+        <w:fldChar w:fldCharType="separate"/>
+      </w:r>
+      <w:r>
+        <w:rPr>
+          <w:noProof/>
+        </w:rPr>
+        <w:t>29</w:t>
+      </w:r>
+      <w:r>
+        <w:rPr>
+          <w:noProof/>
+        </w:rPr>
+        <w:fldChar w:fldCharType="end"/>
+      </w:r>
       <w:r>
         <w:t xml:space="preserve"> - Risk status and gender correlations after data clean</w:t>
       </w:r>
@@ -2948,6 +3836,9 @@
       </w:r>
       <w:r>
         <w:t xml:space="preserve"> Author</w:t>
+      </w:r>
+      <w:r>
+        <w:t xml:space="preserve"> </w:t>
       </w:r>
     </w:p>
     <w:p>
@@ -3002,7 +3893,13 @@
         <w:t xml:space="preserve"> The actual outcome within the </w:t>
       </w:r>
       <w:r>
-        <w:t xml:space="preserve">dataset was that there is a random correleation </w:t>
+        <w:t xml:space="preserve">dataset was that there is a random </w:t>
+      </w:r>
+      <w:r>
+        <w:t>correlation</w:t>
+      </w:r>
+      <w:r>
+        <w:t xml:space="preserve"> </w:t>
       </w:r>
       <w:r>
         <w:t xml:space="preserve">between a person’s cholesterol and their systolic BP. </w:t>
@@ -3017,6 +3914,9 @@
         <w:jc w:val="center"/>
       </w:pPr>
       <w:r>
+        <w:rPr>
+          <w:noProof/>
+        </w:rPr>
         <w:drawing>
           <wp:inline distT="0" distB="0" distL="0" distR="0" wp14:anchorId="6A52ACB1" wp14:editId="347F66AE">
             <wp:extent cx="4210685" cy="1491887"/>
@@ -3061,14 +3961,27 @@
       <w:r>
         <w:t xml:space="preserve">Figure </w:t>
       </w:r>
-      <w:fldSimple w:instr=" SEQ Figure \* ARABIC ">
-        <w:r>
-          <w:rPr>
-            <w:noProof/>
-          </w:rPr>
-          <w:t>30</w:t>
-        </w:r>
-      </w:fldSimple>
+      <w:r>
+        <w:fldChar w:fldCharType="begin"/>
+      </w:r>
+      <w:r>
+        <w:instrText xml:space="preserve"> SEQ Figure \* ARABIC </w:instrText>
+      </w:r>
+      <w:r>
+        <w:fldChar w:fldCharType="separate"/>
+      </w:r>
+      <w:r>
+        <w:rPr>
+          <w:noProof/>
+        </w:rPr>
+        <w:t>30</w:t>
+      </w:r>
+      <w:r>
+        <w:rPr>
+          <w:noProof/>
+        </w:rPr>
+        <w:fldChar w:fldCharType="end"/>
+      </w:r>
       <w:r>
         <w:t xml:space="preserve"> - Code to create the Scatter Plot</w:t>
       </w:r>
@@ -3078,7 +3991,16 @@
         <w:pStyle w:val="Caption"/>
       </w:pPr>
       <w:r>
-        <w:t>Source - Author</w:t>
+        <w:t xml:space="preserve">Source </w:t>
+      </w:r>
+      <w:r>
+        <w:t>–</w:t>
+      </w:r>
+      <w:r>
+        <w:t xml:space="preserve"> Author</w:t>
+      </w:r>
+      <w:r>
+        <w:t xml:space="preserve"> </w:t>
       </w:r>
     </w:p>
     <w:p>
@@ -3086,6 +4008,9 @@
         <w:keepNext/>
       </w:pPr>
       <w:r>
+        <w:rPr>
+          <w:noProof/>
+        </w:rPr>
         <w:drawing>
           <wp:inline distT="0" distB="0" distL="0" distR="0" wp14:anchorId="5BEBECF5" wp14:editId="41AA9840">
             <wp:extent cx="3385457" cy="2739947"/>
@@ -3130,14 +4055,27 @@
       <w:r>
         <w:t xml:space="preserve">Figure </w:t>
       </w:r>
-      <w:fldSimple w:instr=" SEQ Figure \* ARABIC ">
-        <w:r>
-          <w:rPr>
-            <w:noProof/>
-          </w:rPr>
-          <w:t>31</w:t>
-        </w:r>
-      </w:fldSimple>
+      <w:r>
+        <w:fldChar w:fldCharType="begin"/>
+      </w:r>
+      <w:r>
+        <w:instrText xml:space="preserve"> SEQ Figure \* ARABIC </w:instrText>
+      </w:r>
+      <w:r>
+        <w:fldChar w:fldCharType="separate"/>
+      </w:r>
+      <w:r>
+        <w:rPr>
+          <w:noProof/>
+        </w:rPr>
+        <w:t>31</w:t>
+      </w:r>
+      <w:r>
+        <w:rPr>
+          <w:noProof/>
+        </w:rPr>
+        <w:fldChar w:fldCharType="end"/>
+      </w:r>
       <w:r>
         <w:t xml:space="preserve"> - Scatter plot of Cholesterol vs Systolic BP after data clean</w:t>
       </w:r>
@@ -3147,7 +4085,16 @@
         <w:pStyle w:val="Caption"/>
       </w:pPr>
       <w:r>
-        <w:t>Source - Author</w:t>
+        <w:t xml:space="preserve">Source </w:t>
+      </w:r>
+      <w:r>
+        <w:t>–</w:t>
+      </w:r>
+      <w:r>
+        <w:t xml:space="preserve"> Author</w:t>
+      </w:r>
+      <w:r>
+        <w:t xml:space="preserve"> </w:t>
       </w:r>
     </w:p>
     <w:p>
@@ -3175,13 +4122,26 @@
         <w:t xml:space="preserve"> data</w:t>
       </w:r>
       <w:r>
-        <w:t xml:space="preserve">, there can be enough identifiable information within a record that linked with other datasets can uniquely identify the person. </w:t>
+        <w:t xml:space="preserve">, there can be enough identifiable information within a record that linked </w:t>
+      </w:r>
+      <w:commentRangeStart w:id="2"/>
+      <w:r>
+        <w:t xml:space="preserve">with other datasets can uniquely identify the person. </w:t>
       </w:r>
       <w:r>
         <w:t>As such the utmost care should be taken when accessing, transporting or utilizing the data.</w:t>
       </w:r>
       <w:r>
         <w:t xml:space="preserve"> In addition to making sure that the consent of everyone’s data being used in this way understands the privacy risks taken when this will inevitably be leaked/hacked in some way. </w:t>
+      </w:r>
+      <w:commentRangeEnd w:id="2"/>
+      <w:r>
+        <w:rPr>
+          <w:rStyle w:val="CommentReference"/>
+          <w:sz w:val="24"/>
+          <w:szCs w:val="24"/>
+        </w:rPr>
+        <w:commentReference w:id="2"/>
       </w:r>
     </w:p>
     <w:p>
@@ -3233,6 +4193,309 @@
       </w:r>
       <w:r>
         <w:t xml:space="preserve"> issues with the dataset.</w:t>
+      </w:r>
+    </w:p>
+    <w:p>
+      <w:pPr>
+        <w:pStyle w:val="Heading1"/>
+      </w:pPr>
+      <w:r>
+        <w:t>Reflection:</w:t>
+      </w:r>
+    </w:p>
+    <w:p>
+      <w:r>
+        <w:t>Throughout the process of creating this report there were numerous items learnt. These include the ability to understand the technical API pandas</w:t>
+      </w:r>
+      <w:r>
+        <w:t xml:space="preserve"> </w:t>
+      </w:r>
+      <w:r>
+        <w:fldChar w:fldCharType="begin"/>
+      </w:r>
+      <w:r>
+        <w:instrText xml:space="preserve"> ADDIN ZOTERO_ITEM CSL_CITATION {"citationID":"Xli9wwz5","properties":{"unsorted":false,"formattedCitation":"(pandas, n.d.)","plainCitation":"(pandas, n.d.)","noteIndex":0},"citationItems":[{"id":48,"uris":["http://zotero.org/users/local/ZgM2QhaK/items/RUXZXTQT"],"itemData":{"id":48,"type":"webpage","title":"DataFrame — pandas 3.0.2 documentation","URL":"https://pandas.pydata.org/pandas-docs/stable/reference/frame.html","author":[{"literal":"pandas"}],"accessed":{"date-parts":[["2026",4,8]]}}}],"schema":"https://github.com/citation-style-language/schema/raw/master/csl-citation.json"} </w:instrText>
+      </w:r>
+      <w:r>
+        <w:fldChar w:fldCharType="separate"/>
+      </w:r>
+      <w:r>
+        <w:rPr>
+          <w:rFonts w:ascii="Aptos" w:hAnsi="Aptos"/>
+        </w:rPr>
+        <w:t>(pandas, n.d.)</w:t>
+      </w:r>
+      <w:r>
+        <w:fldChar w:fldCharType="end"/>
+      </w:r>
+      <w:r>
+        <w:t xml:space="preserve"> </w:t>
+      </w:r>
+      <w:r>
+        <w:t>and</w:t>
+      </w:r>
+      <w:r>
+        <w:t xml:space="preserve"> matplotlib</w:t>
+      </w:r>
+      <w:r>
+        <w:t xml:space="preserve"> </w:t>
+      </w:r>
+      <w:r>
+        <w:fldChar w:fldCharType="begin"/>
+      </w:r>
+      <w:r>
+        <w:instrText xml:space="preserve"> ADDIN ZOTERO_ITEM CSL_CITATION {"citationID":"ei7ZUMQD","properties":{"unsorted":false,"formattedCitation":"(matplotlib, n.d.)","plainCitation":"(matplotlib, n.d.)","noteIndex":0},"citationItems":[{"id":46,"uris":["http://zotero.org/users/local/ZgM2QhaK/items/VVDC5C88"],"itemData":{"id":46,"type":"webpage","title":"API Reference — Matplotlib 3.10.8 documentation","URL":"https://matplotlib.org/stable/api/index.html","author":[{"literal":"matplotlib"}],"accessed":{"date-parts":[["2026",4,8]]}}}],"schema":"https://github.com/citation-style-language/schema/raw/master/csl-citation.json"} </w:instrText>
+      </w:r>
+      <w:r>
+        <w:fldChar w:fldCharType="separate"/>
+      </w:r>
+      <w:r>
+        <w:rPr>
+          <w:rFonts w:ascii="Aptos" w:hAnsi="Aptos"/>
+        </w:rPr>
+        <w:t>(matplotlib, n.d.)</w:t>
+      </w:r>
+      <w:r>
+        <w:fldChar w:fldCharType="end"/>
+      </w:r>
+      <w:r>
+        <w:t xml:space="preserve"> </w:t>
+      </w:r>
+      <w:r>
+        <w:t>documentation.</w:t>
+      </w:r>
+      <w:r>
+        <w:t xml:space="preserve"> </w:t>
+      </w:r>
+      <w:r>
+        <w:t>This is an important process as you can then apply the knowledge knowing that the information is coming from a primary source</w:t>
+      </w:r>
+      <w:r>
+        <w:t xml:space="preserve"> and matching to the correct </w:t>
+      </w:r>
+      <w:r>
+        <w:t xml:space="preserve">version that is installed locally (I.E </w:t>
+      </w:r>
+      <w:r>
+        <w:t>pandas removing and changing different API calls within the library versions).</w:t>
+      </w:r>
+      <w:r>
+        <w:t xml:space="preserve"> Once </w:t>
+      </w:r>
+      <w:r>
+        <w:t xml:space="preserve">this skill is learnt, it is quite easy to </w:t>
+      </w:r>
+      <w:r>
+        <w:t xml:space="preserve">apply this to other types of software documentation (E.g. matplotlib, seaborn, python 3.13, git). </w:t>
+      </w:r>
+      <w:r>
+        <w:t>More personal skills that were honed throughout this task are NeoVim</w:t>
+      </w:r>
+      <w:r>
+        <w:t>’</w:t>
+      </w:r>
+      <w:r>
+        <w:t xml:space="preserve">s 3 different modes (Normal, Insert and </w:t>
+      </w:r>
+      <w:r>
+        <w:t>Visual) for movement and remember</w:t>
+      </w:r>
+      <w:r>
+        <w:t>ing</w:t>
+      </w:r>
+      <w:r>
+        <w:t xml:space="preserve"> and practicing keyboard inputs and macros</w:t>
+      </w:r>
+      <w:r>
+        <w:t xml:space="preserve"> </w:t>
+      </w:r>
+      <w:r>
+        <w:fldChar w:fldCharType="begin"/>
+      </w:r>
+      <w:r>
+        <w:instrText xml:space="preserve"> ADDIN ZOTERO_ITEM CSL_CITATION {"citationID":"pG2q6yun","properties":{"unsorted":false,"formattedCitation":"(\\uc0\\u8220{}neovim/neovim,\\uc0\\u8221{} 2026)","plainCitation":"(“neovim/neovim,” 2026)","noteIndex":0},"citationItems":[{"id":50,"uris":["http://zotero.org/users/local/ZgM2QhaK/items/5X6TLUUC"],"itemData":{"id":50,"type":"software","abstract":"Vim-fork focused on extensibility and usability","genre":"Vim Script","note":"original-date: 2014-01-31T13:39:22Z","publisher":"Neovim","source":"GitHub","title":"neovim/neovim","URL":"https://github.com/neovim/neovim","accessed":{"date-parts":[["2026",4,8]]},"issued":{"date-parts":[["2026",4,8]]}}}],"schema":"https://github.com/citation-style-language/schema/raw/master/csl-citation.json"} </w:instrText>
+      </w:r>
+      <w:r>
+        <w:fldChar w:fldCharType="separate"/>
+      </w:r>
+      <w:r>
+        <w:rPr>
+          <w:rFonts w:ascii="Aptos" w:hAnsi="Aptos" w:cs="Times New Roman"/>
+          <w:kern w:val="0"/>
+        </w:rPr>
+        <w:t>(“neovim/neovim,” 2026)</w:t>
+      </w:r>
+      <w:r>
+        <w:fldChar w:fldCharType="end"/>
+      </w:r>
+      <w:r>
+        <w:t xml:space="preserve">. As well as creating custom keyboard shortcuts within </w:t>
+      </w:r>
+      <w:r>
+        <w:t xml:space="preserve">Neovim for launching the python program within a terminal window and git integrations for commit history. </w:t>
+      </w:r>
+      <w:r>
+        <w:t xml:space="preserve">Leading into </w:t>
+      </w:r>
+      <w:r>
+        <w:t>the final skill learnt is the git commit process (git add ., git commit -m “Commit message” and git push)</w:t>
+      </w:r>
+      <w:r>
+        <w:t xml:space="preserve"> </w:t>
+      </w:r>
+      <w:r>
+        <w:fldChar w:fldCharType="begin"/>
+      </w:r>
+      <w:r>
+        <w:instrText xml:space="preserve"> ADDIN ZOTERO_ITEM CSL_CITATION {"citationID":"miSDd0TK","properties":{"unsorted":false,"formattedCitation":"(Linux Foundation, n.d.)","plainCitation":"(Linux Foundation, n.d.)","noteIndex":0},"citationItems":[{"id":44,"uris":["http://zotero.org/users/local/ZgM2QhaK/items/WHRRP256"],"itemData":{"id":44,"type":"webpage","title":"Git - Reference","URL":"https://git-scm.com/docs","author":[{"literal":"Linux Foundation"}],"accessed":{"date-parts":[["2026",4,8]]}}}],"schema":"https://github.com/citation-style-language/schema/raw/master/csl-citation.json"} </w:instrText>
+      </w:r>
+      <w:r>
+        <w:fldChar w:fldCharType="separate"/>
+      </w:r>
+      <w:r>
+        <w:rPr>
+          <w:rFonts w:ascii="Aptos" w:hAnsi="Aptos"/>
+        </w:rPr>
+        <w:t>(Linux Foundation, n.d.)</w:t>
+      </w:r>
+      <w:r>
+        <w:fldChar w:fldCharType="end"/>
+      </w:r>
+      <w:r>
+        <w:t xml:space="preserve">. A useful skill to learn as this </w:t>
+      </w:r>
+      <w:r>
+        <w:t>open-source</w:t>
+      </w:r>
+      <w:r>
+        <w:t xml:space="preserve"> program is used everywhere within the programming </w:t>
+      </w:r>
+      <w:r>
+        <w:t xml:space="preserve">industry for commit history, rollback functions and group collaboration. As well as being able to keep </w:t>
+      </w:r>
+      <w:r>
+        <w:t>up to date</w:t>
+      </w:r>
+      <w:r>
+        <w:t xml:space="preserve"> with different version of the program in different branches. Thus, throughout the course of completing this report, </w:t>
+      </w:r>
+      <w:r>
+        <w:t>several</w:t>
+      </w:r>
+      <w:r>
+        <w:t xml:space="preserve"> different items were learnt.</w:t>
+      </w:r>
+    </w:p>
+    <w:p>
+      <w:r>
+        <w:br w:type="page"/>
+      </w:r>
+    </w:p>
+    <w:p>
+      <w:pPr>
+        <w:pStyle w:val="Heading1"/>
+      </w:pPr>
+      <w:r>
+        <w:lastRenderedPageBreak/>
+        <w:t>References:</w:t>
+      </w:r>
+    </w:p>
+    <w:p>
+      <w:pPr>
+        <w:pStyle w:val="Bibliography"/>
+      </w:pPr>
+      <w:r>
+        <w:fldChar w:fldCharType="begin"/>
+      </w:r>
+      <w:r>
+        <w:instrText xml:space="preserve"> ADDIN ZOTERO_BIBL {"uncited":[],"omitted":[],"custom":[]} CSL_BIBLIOGRAPHY </w:instrText>
+      </w:r>
+      <w:r>
+        <w:fldChar w:fldCharType="separate"/>
+      </w:r>
+      <w:r>
+        <w:t>American Heart Foundation, 2026. What Is Cholesterol? [WWW Document]. www.heart.org. URL https://www.heart.org/en/health-topics/cholesterol/about-cholesterol (accessed 4.6.26).</w:t>
+      </w:r>
+    </w:p>
+    <w:p>
+      <w:pPr>
+        <w:pStyle w:val="Bibliography"/>
+      </w:pPr>
+      <w:r>
+        <w:t>Dale, B., 2025. Ethel Caterham, world’s oldest living person, marks 116th birthday. BBC.</w:t>
+      </w:r>
+    </w:p>
+    <w:p>
+      <w:pPr>
+        <w:pStyle w:val="Bibliography"/>
+      </w:pPr>
+      <w:r>
+        <w:t>Linux Foundation, n.d. Git - Reference [WWW Document]. URL https://git-scm.com/docs (accessed 4.8.26).</w:t>
+      </w:r>
+    </w:p>
+    <w:p>
+      <w:pPr>
+        <w:pStyle w:val="Bibliography"/>
+      </w:pPr>
+      <w:r>
+        <w:t>matplotlib, n.d. API Reference — Matplotlib 3.10.8 documentation [WWW Document]. URL https://matplotlib.org/stable/api/index.html (accessed 4.8.26).</w:t>
+      </w:r>
+    </w:p>
+    <w:p>
+      <w:pPr>
+        <w:pStyle w:val="Bibliography"/>
+      </w:pPr>
+      <w:r>
+        <w:t>neovim/neovim, 2026.</w:t>
+      </w:r>
+      <w:r>
+        <w:t xml:space="preserve"> </w:t>
+      </w:r>
+      <w:r>
+        <w:t>https://github.com/neovim/neovim</w:t>
+      </w:r>
+    </w:p>
+    <w:p>
+      <w:pPr>
+        <w:pStyle w:val="Bibliography"/>
+      </w:pPr>
+      <w:r>
+        <w:t>pandas, n.d. DataFrame — pandas 3.0.2 documentation [WWW Document]. URL https://pandas.pydata.org/pandas-docs/stable/reference/frame.html (accessed 4.8.26).</w:t>
+      </w:r>
+    </w:p>
+    <w:p>
+      <w:pPr>
+        <w:pStyle w:val="Bibliography"/>
+      </w:pPr>
+      <w:r>
+        <w:t>World Health Organization, n.d. Thinness among children and adolescents, BMI &lt; -2 standard deviations below the median, prevalence (crude estimate) (%).</w:t>
+      </w:r>
+    </w:p>
+    <w:p>
+      <w:pPr>
+        <w:pStyle w:val="Bibliography"/>
+      </w:pPr>
+      <w:r>
+        <w:t>World Health Organization, n.d. Underweight among adults, BMI &lt; 18.5, prevalence (age-standardized estimate) (%).</w:t>
+      </w:r>
+    </w:p>
+    <w:p>
+      <w:pPr>
+        <w:pStyle w:val="Bibliography"/>
+      </w:pPr>
+      <w:r>
+        <w:t>Wyer, L., n.d. Python-Pandas.</w:t>
+      </w:r>
+      <w:r>
+        <w:t xml:space="preserve"> </w:t>
+      </w:r>
+      <w:r>
+        <w:t>https://github.com/BayElectrician/Python-Pandas</w:t>
+      </w:r>
+    </w:p>
+    <w:p>
+      <w:r>
+        <w:fldChar w:fldCharType="end"/>
       </w:r>
     </w:p>
     <w:sectPr>
@@ -3263,24 +4526,62 @@
       </w:r>
     </w:p>
   </w:comment>
+  <w:comment w:id="1" w:author="Lachlan Wyer" w:date="2026-04-08T09:31:00Z" w:initials="LW">
+    <w:p>
+      <w:pPr>
+        <w:pStyle w:val="CommentText"/>
+      </w:pPr>
+      <w:r>
+        <w:rPr>
+          <w:rStyle w:val="CommentReference"/>
+        </w:rPr>
+        <w:annotationRef/>
+      </w:r>
+      <w:r>
+        <w:t xml:space="preserve">Not that deep </w:t>
+      </w:r>
+    </w:p>
+  </w:comment>
+  <w:comment w:id="2" w:author="Lachlan Wyer" w:date="2026-04-08T10:10:00Z" w:initials="LW">
+    <w:p>
+      <w:pPr>
+        <w:pStyle w:val="CommentText"/>
+      </w:pPr>
+      <w:r>
+        <w:rPr>
+          <w:rStyle w:val="CommentReference"/>
+        </w:rPr>
+        <w:annotationRef/>
+      </w:r>
+      <w:r>
+        <w:t>Complete health Data</w:t>
+      </w:r>
+    </w:p>
+  </w:comment>
 </w:comments>
 </file>
 
 <file path=word/commentsExtended.xml><?xml version="1.0" encoding="utf-8"?>
 <w15:commentsEx xmlns:wpc="http://schemas.microsoft.com/office/word/2010/wordprocessingCanvas" xmlns:cx="http://schemas.microsoft.com/office/drawing/2014/chartex" xmlns:cx1="http://schemas.microsoft.com/office/drawing/2015/9/8/chartex" xmlns:cx2="http://schemas.microsoft.com/office/drawing/2015/10/21/chartex" xmlns:cx3="http://schemas.microsoft.com/office/drawing/2016/5/9/chartex" xmlns:cx4="http://schemas.microsoft.com/office/drawing/2016/5/10/chartex" xmlns:cx5="http://schemas.microsoft.com/office/drawing/2016/5/11/chartex" xmlns:cx6="http://schemas.microsoft.com/office/drawing/2016/5/12/chartex" xmlns:cx7="http://schemas.microsoft.com/office/drawing/2016/5/13/chartex" xmlns:cx8="http://schemas.microsoft.com/office/drawing/2016/5/14/chartex" xmlns:mc="http://schemas.openxmlformats.org/markup-compatibility/2006" xmlns:aink="http://schemas.microsoft.com/office/drawing/2016/ink" xmlns:am3d="http://schemas.microsoft.com/office/drawing/2017/model3d" xmlns:o="urn:schemas-microsoft-com:office:office" xmlns:oel="http://schemas.microsoft.com/office/2019/extlst" xmlns:r="http://schemas.openxmlformats.org/officeDocument/2006/relationships" xmlns:m="http://schemas.openxmlformats.org/officeDocument/2006/math" xmlns:v="urn:schemas-microsoft-com:vml" xmlns:wp14="http://schemas.microsoft.com/office/word/2010/wordprocessingDrawing" xmlns:wp="http://schemas.openxmlformats.org/drawingml/2006/wordprocessingDrawing" xmlns:w10="urn:schemas-microsoft-com:office:word" xmlns:w="http://schemas.openxmlformats.org/wordprocessingml/2006/main" xmlns:w14="http://schemas.microsoft.com/office/word/2010/wordml" xmlns:w15="http://schemas.microsoft.com/office/word/2012/wordml" xmlns:w16cex="http://schemas.microsoft.com/office/word/2018/wordml/cex" xmlns:w16cid="http://schemas.microsoft.com/office/word/2016/wordml/cid" xmlns:w16="http://schemas.microsoft.com/office/word/2018/wordml" xmlns:w16du="http://schemas.microsoft.com/office/word/2023/wordml/word16du" xmlns:w16sdtdh="http://schemas.microsoft.com/office/word/2020/wordml/sdtdatahash" xmlns:w16sdtfl="http://schemas.microsoft.com/office/word/2024/wordml/sdtformatlock" xmlns:w16se="http://schemas.microsoft.com/office/word/2015/wordml/symex" xmlns:wpg="http://schemas.microsoft.com/office/word/2010/wordprocessingGroup" xmlns:wpi="http://schemas.microsoft.com/office/word/2010/wordprocessingInk" xmlns:wne="http://schemas.microsoft.com/office/word/2006/wordml" xmlns:wps="http://schemas.microsoft.com/office/word/2010/wordprocessingShape" mc:Ignorable="w14 w15 w16se w16cid w16 w16cex w16sdtdh w16sdtfl w16du wp14">
   <w15:commentEx w15:paraId="39E1C048" w15:done="0"/>
+  <w15:commentEx w15:paraId="570A86E1" w15:paraIdParent="39E1C048" w15:done="0"/>
+  <w15:commentEx w15:paraId="2478A7E3" w15:done="0"/>
 </w15:commentsEx>
 </file>
 
 <file path=word/commentsExtensible.xml><?xml version="1.0" encoding="utf-8"?>
 <w16cex:commentsExtensible xmlns:wpc="http://schemas.microsoft.com/office/word/2010/wordprocessingCanvas" xmlns:cx="http://schemas.microsoft.com/office/drawing/2014/chartex" xmlns:cx1="http://schemas.microsoft.com/office/drawing/2015/9/8/chartex" xmlns:cx2="http://schemas.microsoft.com/office/drawing/2015/10/21/chartex" xmlns:cx3="http://schemas.microsoft.com/office/drawing/2016/5/9/chartex" xmlns:cx4="http://schemas.microsoft.com/office/drawing/2016/5/10/chartex" xmlns:cx5="http://schemas.microsoft.com/office/drawing/2016/5/11/chartex" xmlns:cx6="http://schemas.microsoft.com/office/drawing/2016/5/12/chartex" xmlns:cx7="http://schemas.microsoft.com/office/drawing/2016/5/13/chartex" xmlns:cx8="http://schemas.microsoft.com/office/drawing/2016/5/14/chartex" xmlns:cr="http://schemas.microsoft.com/office/comments/2020/reactions" xmlns:mc="http://schemas.openxmlformats.org/markup-compatibility/2006" xmlns:aink="http://schemas.microsoft.com/office/drawing/2016/ink" xmlns:am3d="http://schemas.microsoft.com/office/drawing/2017/model3d" xmlns:o="urn:schemas-microsoft-com:office:office" xmlns:oel="http://schemas.microsoft.com/office/2019/extlst" xmlns:r="http://schemas.openxmlformats.org/officeDocument/2006/relationships" xmlns:m="http://schemas.openxmlformats.org/officeDocument/2006/math" xmlns:v="urn:schemas-microsoft-com:vml" xmlns:wp14="http://schemas.microsoft.com/office/word/2010/wordprocessingDrawing" xmlns:wp="http://schemas.openxmlformats.org/drawingml/2006/wordprocessingDrawing" xmlns:w10="urn:schemas-microsoft-com:office:word" xmlns:w="http://schemas.openxmlformats.org/wordprocessingml/2006/main" xmlns:w14="http://schemas.microsoft.com/office/word/2010/wordml" xmlns:w15="http://schemas.microsoft.com/office/word/2012/wordml" xmlns:w16cex="http://schemas.microsoft.com/office/word/2018/wordml/cex" xmlns:w16cid="http://schemas.microsoft.com/office/word/2016/wordml/cid" xmlns:w16="http://schemas.microsoft.com/office/word/2018/wordml" xmlns:w16du="http://schemas.microsoft.com/office/word/2023/wordml/word16du" xmlns:w16sdtdh="http://schemas.microsoft.com/office/word/2020/wordml/sdtdatahash" xmlns:w16sdtfl="http://schemas.microsoft.com/office/word/2024/wordml/sdtformatlock" xmlns:w16se="http://schemas.microsoft.com/office/word/2015/wordml/symex" xmlns:wpg="http://schemas.microsoft.com/office/word/2010/wordprocessingGroup" xmlns:wpi="http://schemas.microsoft.com/office/word/2010/wordprocessingInk" xmlns:wne="http://schemas.microsoft.com/office/word/2006/wordml" xmlns:wps="http://schemas.microsoft.com/office/word/2010/wordprocessingShape" mc:Ignorable="w14 w15 w16se w16cid w16 w16cex w16sdtdh w16sdtfl cr w16du wp14">
   <w16cex:commentExtensible w16cex:durableId="5A2F50C7" w16cex:dateUtc="2026-04-06T01:44:00Z"/>
+  <w16cex:commentExtensible w16cex:durableId="2D97320F" w16cex:dateUtc="2026-04-07T23:31:00Z"/>
+  <w16cex:commentExtensible w16cex:durableId="0486FC36" w16cex:dateUtc="2026-04-08T00:10:00Z"/>
 </w16cex:commentsExtensible>
 </file>
 
 <file path=word/commentsIds.xml><?xml version="1.0" encoding="utf-8"?>
 <w16cid:commentsIds xmlns:wpc="http://schemas.microsoft.com/office/word/2010/wordprocessingCanvas" xmlns:cx="http://schemas.microsoft.com/office/drawing/2014/chartex" xmlns:cx1="http://schemas.microsoft.com/office/drawing/2015/9/8/chartex" xmlns:cx2="http://schemas.microsoft.com/office/drawing/2015/10/21/chartex" xmlns:cx3="http://schemas.microsoft.com/office/drawing/2016/5/9/chartex" xmlns:cx4="http://schemas.microsoft.com/office/drawing/2016/5/10/chartex" xmlns:cx5="http://schemas.microsoft.com/office/drawing/2016/5/11/chartex" xmlns:cx6="http://schemas.microsoft.com/office/drawing/2016/5/12/chartex" xmlns:cx7="http://schemas.microsoft.com/office/drawing/2016/5/13/chartex" xmlns:cx8="http://schemas.microsoft.com/office/drawing/2016/5/14/chartex" xmlns:mc="http://schemas.openxmlformats.org/markup-compatibility/2006" xmlns:aink="http://schemas.microsoft.com/office/drawing/2016/ink" xmlns:am3d="http://schemas.microsoft.com/office/drawing/2017/model3d" xmlns:o="urn:schemas-microsoft-com:office:office" xmlns:oel="http://schemas.microsoft.com/office/2019/extlst" xmlns:r="http://schemas.openxmlformats.org/officeDocument/2006/relationships" xmlns:m="http://schemas.openxmlformats.org/officeDocument/2006/math" xmlns:v="urn:schemas-microsoft-com:vml" xmlns:wp14="http://schemas.microsoft.com/office/word/2010/wordprocessingDrawing" xmlns:wp="http://schemas.openxmlformats.org/drawingml/2006/wordprocessingDrawing" xmlns:w10="urn:schemas-microsoft-com:office:word" xmlns:w="http://schemas.openxmlformats.org/wordprocessingml/2006/main" xmlns:w14="http://schemas.microsoft.com/office/word/2010/wordml" xmlns:w15="http://schemas.microsoft.com/office/word/2012/wordml" xmlns:w16cex="http://schemas.microsoft.com/office/word/2018/wordml/cex" xmlns:w16cid="http://schemas.microsoft.com/office/word/2016/wordml/cid" xmlns:w16="http://schemas.microsoft.com/office/word/2018/wordml" xmlns:w16du="http://schemas.microsoft.com/office/word/2023/wordml/word16du" xmlns:w16sdtdh="http://schemas.microsoft.com/office/word/2020/wordml/sdtdatahash" xmlns:w16sdtfl="http://schemas.microsoft.com/office/word/2024/wordml/sdtformatlock" xmlns:w16se="http://schemas.microsoft.com/office/word/2015/wordml/symex" xmlns:wpg="http://schemas.microsoft.com/office/word/2010/wordprocessingGroup" xmlns:wpi="http://schemas.microsoft.com/office/word/2010/wordprocessingInk" xmlns:wne="http://schemas.microsoft.com/office/word/2006/wordml" xmlns:wps="http://schemas.microsoft.com/office/word/2010/wordprocessingShape" mc:Ignorable="w14 w15 w16se w16cid w16 w16cex w16sdtdh w16sdtfl w16du wp14">
   <w16cid:commentId w16cid:paraId="39E1C048" w16cid:durableId="5A2F50C7"/>
+  <w16cid:commentId w16cid:paraId="570A86E1" w16cid:durableId="2D97320F"/>
+  <w16cid:commentId w16cid:paraId="2478A7E3" w16cid:durableId="0486FC36"/>
 </w16cid:commentsIds>
 </file>
 
@@ -4069,6 +5370,14 @@
       <w:color w:val="0A2F40" w:themeColor="accent1" w:themeShade="7F"/>
     </w:rPr>
   </w:style>
+  <w:style w:type="paragraph" w:styleId="Bibliography">
+    <w:name w:val="Bibliography"/>
+    <w:basedOn w:val="Normal"/>
+    <w:next w:val="Normal"/>
+    <w:uiPriority w:val="37"/>
+    <w:unhideWhenUsed/>
+    <w:rsid w:val="006C4607"/>
+  </w:style>
 </w:styles>
 </file>
 

</xml_diff>